<commit_message>
Final consistency pass and main.docx/main.pdf
</commit_message>
<xml_diff>
--- a/paper/docx/manuscript.docx
+++ b/paper/docx/manuscript.docx
@@ -133,7 +133,9 @@
           <w:sz w:val="19"/>
           <w:szCs w:val="19"/>
         </w:rPr>
-        <w:t>ORCID: 0009-0004-7032-6847 (Pushkal Gupta), 0009-0003-0735-264X (Vanka Kaushik), 0000-0003-4027-3137 (Kalaavathi B)</w:t>
+        <w:t>ORCID: 0009-0004-7032-6847 (P. Gupta), 0009-0003-0735-264X (V. Kaushik),</w:t>
+        <w:br/>
+        <w:t>0000-0003-4027-3137 (Kalaavathi B)</w:t>
       </w:r>
     </w:p>
     <w:p>
@@ -2758,7 +2760,115 @@
           <w:sz w:val="22"/>
           <w:szCs w:val="22"/>
         </w:rPr>
-        <w:t xml:space="preserve">; the two were not combined, because a composite would be dominated by the level term (it made up 94 % of the earlier composite index).</w:t>
+        <w:t xml:space="preserve">; the two were not combined, because a composite would be dominated by the level term (it made up 94 % of </w:t>
+      </w:r>
+      <m:oMath>
+        <m:sSub>
+          <m:e>
+            <m:r>
+              <w:rPr>
+                <w:rFonts w:ascii="Cambria Math" w:hAnsi="Cambria Math"/>
+                <w:sz w:val="22"/>
+                <w:szCs w:val="22"/>
+              </w:rPr>
+              <m:t>H</m:t>
+            </m:r>
+          </m:e>
+          <m:sub>
+            <m:r>
+              <m:rPr>
+                <m:sty m:val="p"/>
+              </m:rPr>
+              <w:rPr>
+                <w:rFonts w:ascii="Cambria Math" w:hAnsi="Cambria Math"/>
+                <w:sz w:val="22"/>
+                <w:szCs w:val="22"/>
+              </w:rPr>
+              <m:t>JS</m:t>
+            </m:r>
+          </m:sub>
+        </m:sSub>
+        <m:r>
+          <w:rPr>
+            <w:rFonts w:ascii="Cambria Math" w:hAnsi="Cambria Math"/>
+            <w:sz w:val="22"/>
+            <w:szCs w:val="22"/>
+          </w:rPr>
+          <m:t>+</m:t>
+        </m:r>
+        <m:sSub>
+          <m:e>
+            <m:r>
+              <w:rPr>
+                <w:rFonts w:ascii="Cambria Math" w:hAnsi="Cambria Math"/>
+                <w:sz w:val="22"/>
+                <w:szCs w:val="22"/>
+              </w:rPr>
+              <m:t>H</m:t>
+            </m:r>
+          </m:e>
+          <m:sub>
+            <m:r>
+              <m:rPr>
+                <m:sty m:val="p"/>
+              </m:rPr>
+              <w:rPr>
+                <w:rFonts w:ascii="Cambria Math" w:hAnsi="Cambria Math"/>
+                <w:sz w:val="22"/>
+                <w:szCs w:val="22"/>
+              </w:rPr>
+              <m:t>CV</m:t>
+            </m:r>
+          </m:sub>
+        </m:sSub>
+        <m:r>
+          <w:rPr>
+            <w:rFonts w:ascii="Cambria Math" w:hAnsi="Cambria Math"/>
+            <w:sz w:val="22"/>
+            <w:szCs w:val="22"/>
+          </w:rPr>
+          <m:t>/(1+</m:t>
+        </m:r>
+        <m:sSub>
+          <m:e>
+            <m:r>
+              <w:rPr>
+                <w:rFonts w:ascii="Cambria Math" w:hAnsi="Cambria Math"/>
+                <w:sz w:val="22"/>
+                <w:szCs w:val="22"/>
+              </w:rPr>
+              <m:t>H</m:t>
+            </m:r>
+          </m:e>
+          <m:sub>
+            <m:r>
+              <m:rPr>
+                <m:sty m:val="p"/>
+              </m:rPr>
+              <w:rPr>
+                <w:rFonts w:ascii="Cambria Math" w:hAnsi="Cambria Math"/>
+                <w:sz w:val="22"/>
+                <w:szCs w:val="22"/>
+              </w:rPr>
+              <m:t>CV</m:t>
+            </m:r>
+          </m:sub>
+        </m:sSub>
+        <m:r>
+          <w:rPr>
+            <w:rFonts w:ascii="Cambria Math" w:hAnsi="Cambria Math"/>
+            <w:sz w:val="22"/>
+            <w:szCs w:val="22"/>
+          </w:rPr>
+          <m:t>)</m:t>
+        </m:r>
+      </m:oMath>
+      <w:r>
+        <w:rPr>
+          <w:sz w:val="22"/>
+          <w:szCs w:val="22"/>
+        </w:rPr>
+        <w:t xml:space="preserve">; Supplementary Table S3).</w:t>
       </w:r>
     </w:p>
     <w:p>
@@ -3867,14 +3977,14 @@
         </w:tblCellMar>
       </w:tblPr>
       <w:tblGrid>
-        <w:gridCol w:w="2578"/>
-        <w:gridCol w:w="601"/>
-        <w:gridCol w:w="1375"/>
-        <w:gridCol w:w="687"/>
-        <w:gridCol w:w="945"/>
-        <w:gridCol w:w="859"/>
-        <w:gridCol w:w="773"/>
-        <w:gridCol w:w="1208"/>
+        <w:gridCol w:w="2554"/>
+        <w:gridCol w:w="596"/>
+        <w:gridCol w:w="1362"/>
+        <w:gridCol w:w="766"/>
+        <w:gridCol w:w="936"/>
+        <w:gridCol w:w="851"/>
+        <w:gridCol w:w="766"/>
+        <w:gridCol w:w="1195"/>
       </w:tblGrid>
       <w:tr>
         <w:trPr>
@@ -3883,7 +3993,7 @@
         </w:trPr>
         <w:tc>
           <w:tcPr>
-            <w:tcW w:w="2578" w:type="dxa"/>
+            <w:tcW w:w="2554" w:type="dxa"/>
             <w:shd w:val="clear" w:color="auto" w:fill="1F3864"/>
             <w:tcMar>
               <w:top w:w="40" w:type="dxa"/>
@@ -3912,7 +4022,7 @@
         </w:tc>
         <w:tc>
           <w:tcPr>
-            <w:tcW w:w="601" w:type="dxa"/>
+            <w:tcW w:w="596" w:type="dxa"/>
             <w:shd w:val="clear" w:color="auto" w:fill="1F3864"/>
             <w:tcMar>
               <w:top w:w="40" w:type="dxa"/>
@@ -3943,7 +4053,7 @@
         </w:tc>
         <w:tc>
           <w:tcPr>
-            <w:tcW w:w="1375" w:type="dxa"/>
+            <w:tcW w:w="1362" w:type="dxa"/>
             <w:shd w:val="clear" w:color="auto" w:fill="1F3864"/>
             <w:tcMar>
               <w:top w:w="40" w:type="dxa"/>
@@ -3972,7 +4082,7 @@
         </w:tc>
         <w:tc>
           <w:tcPr>
-            <w:tcW w:w="687" w:type="dxa"/>
+            <w:tcW w:w="766" w:type="dxa"/>
             <w:shd w:val="clear" w:color="auto" w:fill="1F3864"/>
             <w:tcMar>
               <w:top w:w="40" w:type="dxa"/>
@@ -4001,7 +4111,7 @@
         </w:tc>
         <w:tc>
           <w:tcPr>
-            <w:tcW w:w="945" w:type="dxa"/>
+            <w:tcW w:w="936" w:type="dxa"/>
             <w:shd w:val="clear" w:color="auto" w:fill="1F3864"/>
             <w:tcMar>
               <w:top w:w="40" w:type="dxa"/>
@@ -4030,7 +4140,7 @@
         </w:tc>
         <w:tc>
           <w:tcPr>
-            <w:tcW w:w="859" w:type="dxa"/>
+            <w:tcW w:w="851" w:type="dxa"/>
             <w:shd w:val="clear" w:color="auto" w:fill="1F3864"/>
             <w:tcMar>
               <w:top w:w="40" w:type="dxa"/>
@@ -4059,7 +4169,7 @@
         </w:tc>
         <w:tc>
           <w:tcPr>
-            <w:tcW w:w="773" w:type="dxa"/>
+            <w:tcW w:w="766" w:type="dxa"/>
             <w:shd w:val="clear" w:color="auto" w:fill="1F3864"/>
             <w:tcMar>
               <w:top w:w="40" w:type="dxa"/>
@@ -4088,7 +4198,7 @@
         </w:tc>
         <w:tc>
           <w:tcPr>
-            <w:tcW w:w="1208" w:type="dxa"/>
+            <w:tcW w:w="1195" w:type="dxa"/>
             <w:shd w:val="clear" w:color="auto" w:fill="1F3864"/>
             <w:tcMar>
               <w:top w:w="40" w:type="dxa"/>
@@ -4122,7 +4232,7 @@
         </w:trPr>
         <w:tc>
           <w:tcPr>
-            <w:tcW w:w="2578" w:type="dxa"/>
+            <w:tcW w:w="2554" w:type="dxa"/>
             <w:tcMar>
               <w:top w:w="40" w:type="dxa"/>
               <w:left w:w="80" w:type="dxa"/>
@@ -4147,7 +4257,7 @@
         </w:tc>
         <w:tc>
           <w:tcPr>
-            <w:tcW w:w="601" w:type="dxa"/>
+            <w:tcW w:w="596" w:type="dxa"/>
             <w:tcMar>
               <w:top w:w="40" w:type="dxa"/>
               <w:left w:w="80" w:type="dxa"/>
@@ -4172,7 +4282,7 @@
         </w:tc>
         <w:tc>
           <w:tcPr>
-            <w:tcW w:w="1375" w:type="dxa"/>
+            <w:tcW w:w="1362" w:type="dxa"/>
             <w:tcMar>
               <w:top w:w="40" w:type="dxa"/>
               <w:left w:w="80" w:type="dxa"/>
@@ -4197,7 +4307,7 @@
         </w:tc>
         <w:tc>
           <w:tcPr>
-            <w:tcW w:w="687" w:type="dxa"/>
+            <w:tcW w:w="766" w:type="dxa"/>
             <w:tcMar>
               <w:top w:w="40" w:type="dxa"/>
               <w:left w:w="80" w:type="dxa"/>
@@ -4222,7 +4332,7 @@
         </w:tc>
         <w:tc>
           <w:tcPr>
-            <w:tcW w:w="945" w:type="dxa"/>
+            <w:tcW w:w="936" w:type="dxa"/>
             <w:tcMar>
               <w:top w:w="40" w:type="dxa"/>
               <w:left w:w="80" w:type="dxa"/>
@@ -4247,7 +4357,7 @@
         </w:tc>
         <w:tc>
           <w:tcPr>
-            <w:tcW w:w="859" w:type="dxa"/>
+            <w:tcW w:w="851" w:type="dxa"/>
             <w:tcMar>
               <w:top w:w="40" w:type="dxa"/>
               <w:left w:w="80" w:type="dxa"/>
@@ -4272,7 +4382,7 @@
         </w:tc>
         <w:tc>
           <w:tcPr>
-            <w:tcW w:w="773" w:type="dxa"/>
+            <w:tcW w:w="766" w:type="dxa"/>
             <w:tcMar>
               <w:top w:w="40" w:type="dxa"/>
               <w:left w:w="80" w:type="dxa"/>
@@ -4297,7 +4407,7 @@
         </w:tc>
         <w:tc>
           <w:tcPr>
-            <w:tcW w:w="1208" w:type="dxa"/>
+            <w:tcW w:w="1195" w:type="dxa"/>
             <w:tcMar>
               <w:top w:w="40" w:type="dxa"/>
               <w:left w:w="80" w:type="dxa"/>
@@ -4327,7 +4437,7 @@
         </w:trPr>
         <w:tc>
           <w:tcPr>
-            <w:tcW w:w="2578" w:type="dxa"/>
+            <w:tcW w:w="2554" w:type="dxa"/>
             <w:tcMar>
               <w:top w:w="40" w:type="dxa"/>
               <w:left w:w="80" w:type="dxa"/>
@@ -4352,7 +4462,7 @@
         </w:tc>
         <w:tc>
           <w:tcPr>
-            <w:tcW w:w="601" w:type="dxa"/>
+            <w:tcW w:w="596" w:type="dxa"/>
             <w:tcMar>
               <w:top w:w="40" w:type="dxa"/>
               <w:left w:w="80" w:type="dxa"/>
@@ -4377,7 +4487,7 @@
         </w:tc>
         <w:tc>
           <w:tcPr>
-            <w:tcW w:w="1375" w:type="dxa"/>
+            <w:tcW w:w="1362" w:type="dxa"/>
             <w:tcMar>
               <w:top w:w="40" w:type="dxa"/>
               <w:left w:w="80" w:type="dxa"/>
@@ -4402,7 +4512,7 @@
         </w:tc>
         <w:tc>
           <w:tcPr>
-            <w:tcW w:w="687" w:type="dxa"/>
+            <w:tcW w:w="766" w:type="dxa"/>
             <w:tcMar>
               <w:top w:w="40" w:type="dxa"/>
               <w:left w:w="80" w:type="dxa"/>
@@ -4427,7 +4537,7 @@
         </w:tc>
         <w:tc>
           <w:tcPr>
-            <w:tcW w:w="945" w:type="dxa"/>
+            <w:tcW w:w="936" w:type="dxa"/>
             <w:tcMar>
               <w:top w:w="40" w:type="dxa"/>
               <w:left w:w="80" w:type="dxa"/>
@@ -4452,7 +4562,7 @@
         </w:tc>
         <w:tc>
           <w:tcPr>
-            <w:tcW w:w="859" w:type="dxa"/>
+            <w:tcW w:w="851" w:type="dxa"/>
             <w:tcMar>
               <w:top w:w="40" w:type="dxa"/>
               <w:left w:w="80" w:type="dxa"/>
@@ -4477,7 +4587,7 @@
         </w:tc>
         <w:tc>
           <w:tcPr>
-            <w:tcW w:w="773" w:type="dxa"/>
+            <w:tcW w:w="766" w:type="dxa"/>
             <w:tcMar>
               <w:top w:w="40" w:type="dxa"/>
               <w:left w:w="80" w:type="dxa"/>
@@ -4502,7 +4612,7 @@
         </w:tc>
         <w:tc>
           <w:tcPr>
-            <w:tcW w:w="1208" w:type="dxa"/>
+            <w:tcW w:w="1195" w:type="dxa"/>
             <w:tcMar>
               <w:top w:w="40" w:type="dxa"/>
               <w:left w:w="80" w:type="dxa"/>
@@ -4532,7 +4642,7 @@
         </w:trPr>
         <w:tc>
           <w:tcPr>
-            <w:tcW w:w="2578" w:type="dxa"/>
+            <w:tcW w:w="2554" w:type="dxa"/>
             <w:tcMar>
               <w:top w:w="40" w:type="dxa"/>
               <w:left w:w="80" w:type="dxa"/>
@@ -4557,7 +4667,7 @@
         </w:tc>
         <w:tc>
           <w:tcPr>
-            <w:tcW w:w="601" w:type="dxa"/>
+            <w:tcW w:w="596" w:type="dxa"/>
             <w:tcMar>
               <w:top w:w="40" w:type="dxa"/>
               <w:left w:w="80" w:type="dxa"/>
@@ -4582,7 +4692,7 @@
         </w:tc>
         <w:tc>
           <w:tcPr>
-            <w:tcW w:w="1375" w:type="dxa"/>
+            <w:tcW w:w="1362" w:type="dxa"/>
             <w:tcMar>
               <w:top w:w="40" w:type="dxa"/>
               <w:left w:w="80" w:type="dxa"/>
@@ -4621,7 +4731,7 @@
         </w:tc>
         <w:tc>
           <w:tcPr>
-            <w:tcW w:w="687" w:type="dxa"/>
+            <w:tcW w:w="766" w:type="dxa"/>
             <w:tcMar>
               <w:top w:w="40" w:type="dxa"/>
               <w:left w:w="80" w:type="dxa"/>
@@ -4646,7 +4756,7 @@
         </w:tc>
         <w:tc>
           <w:tcPr>
-            <w:tcW w:w="945" w:type="dxa"/>
+            <w:tcW w:w="936" w:type="dxa"/>
             <w:tcMar>
               <w:top w:w="40" w:type="dxa"/>
               <w:left w:w="80" w:type="dxa"/>
@@ -4671,7 +4781,7 @@
         </w:tc>
         <w:tc>
           <w:tcPr>
-            <w:tcW w:w="859" w:type="dxa"/>
+            <w:tcW w:w="851" w:type="dxa"/>
             <w:tcMar>
               <w:top w:w="40" w:type="dxa"/>
               <w:left w:w="80" w:type="dxa"/>
@@ -4696,7 +4806,7 @@
         </w:tc>
         <w:tc>
           <w:tcPr>
-            <w:tcW w:w="773" w:type="dxa"/>
+            <w:tcW w:w="766" w:type="dxa"/>
             <w:tcMar>
               <w:top w:w="40" w:type="dxa"/>
               <w:left w:w="80" w:type="dxa"/>
@@ -4721,7 +4831,7 @@
         </w:tc>
         <w:tc>
           <w:tcPr>
-            <w:tcW w:w="1208" w:type="dxa"/>
+            <w:tcW w:w="1195" w:type="dxa"/>
             <w:tcMar>
               <w:top w:w="40" w:type="dxa"/>
               <w:left w:w="80" w:type="dxa"/>
@@ -4751,7 +4861,7 @@
         </w:trPr>
         <w:tc>
           <w:tcPr>
-            <w:tcW w:w="2578" w:type="dxa"/>
+            <w:tcW w:w="2554" w:type="dxa"/>
             <w:tcMar>
               <w:top w:w="40" w:type="dxa"/>
               <w:left w:w="80" w:type="dxa"/>
@@ -4776,7 +4886,7 @@
         </w:tc>
         <w:tc>
           <w:tcPr>
-            <w:tcW w:w="601" w:type="dxa"/>
+            <w:tcW w:w="596" w:type="dxa"/>
             <w:tcMar>
               <w:top w:w="40" w:type="dxa"/>
               <w:left w:w="80" w:type="dxa"/>
@@ -4801,7 +4911,7 @@
         </w:tc>
         <w:tc>
           <w:tcPr>
-            <w:tcW w:w="1375" w:type="dxa"/>
+            <w:tcW w:w="1362" w:type="dxa"/>
             <w:tcMar>
               <w:top w:w="40" w:type="dxa"/>
               <w:left w:w="80" w:type="dxa"/>
@@ -4840,7 +4950,7 @@
         </w:tc>
         <w:tc>
           <w:tcPr>
-            <w:tcW w:w="687" w:type="dxa"/>
+            <w:tcW w:w="766" w:type="dxa"/>
             <w:tcMar>
               <w:top w:w="40" w:type="dxa"/>
               <w:left w:w="80" w:type="dxa"/>
@@ -4865,7 +4975,7 @@
         </w:tc>
         <w:tc>
           <w:tcPr>
-            <w:tcW w:w="945" w:type="dxa"/>
+            <w:tcW w:w="936" w:type="dxa"/>
             <w:tcMar>
               <w:top w:w="40" w:type="dxa"/>
               <w:left w:w="80" w:type="dxa"/>
@@ -4890,7 +5000,7 @@
         </w:tc>
         <w:tc>
           <w:tcPr>
-            <w:tcW w:w="859" w:type="dxa"/>
+            <w:tcW w:w="851" w:type="dxa"/>
             <w:tcMar>
               <w:top w:w="40" w:type="dxa"/>
               <w:left w:w="80" w:type="dxa"/>
@@ -4915,7 +5025,7 @@
         </w:tc>
         <w:tc>
           <w:tcPr>
-            <w:tcW w:w="773" w:type="dxa"/>
+            <w:tcW w:w="766" w:type="dxa"/>
             <w:tcMar>
               <w:top w:w="40" w:type="dxa"/>
               <w:left w:w="80" w:type="dxa"/>
@@ -4940,7 +5050,7 @@
         </w:tc>
         <w:tc>
           <w:tcPr>
-            <w:tcW w:w="1208" w:type="dxa"/>
+            <w:tcW w:w="1195" w:type="dxa"/>
             <w:tcMar>
               <w:top w:w="40" w:type="dxa"/>
               <w:left w:w="80" w:type="dxa"/>
@@ -4970,7 +5080,7 @@
         </w:trPr>
         <w:tc>
           <w:tcPr>
-            <w:tcW w:w="2578" w:type="dxa"/>
+            <w:tcW w:w="2554" w:type="dxa"/>
             <w:tcMar>
               <w:top w:w="40" w:type="dxa"/>
               <w:left w:w="80" w:type="dxa"/>
@@ -4995,7 +5105,7 @@
         </w:tc>
         <w:tc>
           <w:tcPr>
-            <w:tcW w:w="601" w:type="dxa"/>
+            <w:tcW w:w="596" w:type="dxa"/>
             <w:tcMar>
               <w:top w:w="40" w:type="dxa"/>
               <w:left w:w="80" w:type="dxa"/>
@@ -5020,7 +5130,7 @@
         </w:tc>
         <w:tc>
           <w:tcPr>
-            <w:tcW w:w="1375" w:type="dxa"/>
+            <w:tcW w:w="1362" w:type="dxa"/>
             <w:tcMar>
               <w:top w:w="40" w:type="dxa"/>
               <w:left w:w="80" w:type="dxa"/>
@@ -5059,7 +5169,7 @@
         </w:tc>
         <w:tc>
           <w:tcPr>
-            <w:tcW w:w="687" w:type="dxa"/>
+            <w:tcW w:w="766" w:type="dxa"/>
             <w:tcMar>
               <w:top w:w="40" w:type="dxa"/>
               <w:left w:w="80" w:type="dxa"/>
@@ -5084,7 +5194,7 @@
         </w:tc>
         <w:tc>
           <w:tcPr>
-            <w:tcW w:w="945" w:type="dxa"/>
+            <w:tcW w:w="936" w:type="dxa"/>
             <w:tcMar>
               <w:top w:w="40" w:type="dxa"/>
               <w:left w:w="80" w:type="dxa"/>
@@ -5109,7 +5219,7 @@
         </w:tc>
         <w:tc>
           <w:tcPr>
-            <w:tcW w:w="859" w:type="dxa"/>
+            <w:tcW w:w="851" w:type="dxa"/>
             <w:tcMar>
               <w:top w:w="40" w:type="dxa"/>
               <w:left w:w="80" w:type="dxa"/>
@@ -5134,7 +5244,7 @@
         </w:tc>
         <w:tc>
           <w:tcPr>
-            <w:tcW w:w="773" w:type="dxa"/>
+            <w:tcW w:w="766" w:type="dxa"/>
             <w:tcMar>
               <w:top w:w="40" w:type="dxa"/>
               <w:left w:w="80" w:type="dxa"/>
@@ -5159,7 +5269,7 @@
         </w:tc>
         <w:tc>
           <w:tcPr>
-            <w:tcW w:w="1208" w:type="dxa"/>
+            <w:tcW w:w="1195" w:type="dxa"/>
             <w:tcMar>
               <w:top w:w="40" w:type="dxa"/>
               <w:left w:w="80" w:type="dxa"/>
@@ -5189,7 +5299,7 @@
         </w:trPr>
         <w:tc>
           <w:tcPr>
-            <w:tcW w:w="2578" w:type="dxa"/>
+            <w:tcW w:w="2554" w:type="dxa"/>
             <w:tcMar>
               <w:top w:w="40" w:type="dxa"/>
               <w:left w:w="80" w:type="dxa"/>
@@ -5214,7 +5324,7 @@
         </w:tc>
         <w:tc>
           <w:tcPr>
-            <w:tcW w:w="601" w:type="dxa"/>
+            <w:tcW w:w="596" w:type="dxa"/>
             <w:tcMar>
               <w:top w:w="40" w:type="dxa"/>
               <w:left w:w="80" w:type="dxa"/>
@@ -5239,7 +5349,7 @@
         </w:tc>
         <w:tc>
           <w:tcPr>
-            <w:tcW w:w="1375" w:type="dxa"/>
+            <w:tcW w:w="1362" w:type="dxa"/>
             <w:tcMar>
               <w:top w:w="40" w:type="dxa"/>
               <w:left w:w="80" w:type="dxa"/>
@@ -5278,7 +5388,7 @@
         </w:tc>
         <w:tc>
           <w:tcPr>
-            <w:tcW w:w="687" w:type="dxa"/>
+            <w:tcW w:w="766" w:type="dxa"/>
             <w:tcMar>
               <w:top w:w="40" w:type="dxa"/>
               <w:left w:w="80" w:type="dxa"/>
@@ -5303,7 +5413,7 @@
         </w:tc>
         <w:tc>
           <w:tcPr>
-            <w:tcW w:w="945" w:type="dxa"/>
+            <w:tcW w:w="936" w:type="dxa"/>
             <w:tcMar>
               <w:top w:w="40" w:type="dxa"/>
               <w:left w:w="80" w:type="dxa"/>
@@ -5328,7 +5438,7 @@
         </w:tc>
         <w:tc>
           <w:tcPr>
-            <w:tcW w:w="859" w:type="dxa"/>
+            <w:tcW w:w="851" w:type="dxa"/>
             <w:tcMar>
               <w:top w:w="40" w:type="dxa"/>
               <w:left w:w="80" w:type="dxa"/>
@@ -5353,7 +5463,7 @@
         </w:tc>
         <w:tc>
           <w:tcPr>
-            <w:tcW w:w="773" w:type="dxa"/>
+            <w:tcW w:w="766" w:type="dxa"/>
             <w:tcMar>
               <w:top w:w="40" w:type="dxa"/>
               <w:left w:w="80" w:type="dxa"/>
@@ -5378,7 +5488,7 @@
         </w:tc>
         <w:tc>
           <w:tcPr>
-            <w:tcW w:w="1208" w:type="dxa"/>
+            <w:tcW w:w="1195" w:type="dxa"/>
             <w:tcMar>
               <w:top w:w="40" w:type="dxa"/>
               <w:left w:w="80" w:type="dxa"/>
@@ -5408,7 +5518,7 @@
         </w:trPr>
         <w:tc>
           <w:tcPr>
-            <w:tcW w:w="2578" w:type="dxa"/>
+            <w:tcW w:w="2554" w:type="dxa"/>
             <w:tcMar>
               <w:top w:w="40" w:type="dxa"/>
               <w:left w:w="80" w:type="dxa"/>
@@ -5433,7 +5543,7 @@
         </w:tc>
         <w:tc>
           <w:tcPr>
-            <w:tcW w:w="601" w:type="dxa"/>
+            <w:tcW w:w="596" w:type="dxa"/>
             <w:tcMar>
               <w:top w:w="40" w:type="dxa"/>
               <w:left w:w="80" w:type="dxa"/>
@@ -5458,7 +5568,7 @@
         </w:tc>
         <w:tc>
           <w:tcPr>
-            <w:tcW w:w="1375" w:type="dxa"/>
+            <w:tcW w:w="1362" w:type="dxa"/>
             <w:tcMar>
               <w:top w:w="40" w:type="dxa"/>
               <w:left w:w="80" w:type="dxa"/>
@@ -5497,7 +5607,7 @@
         </w:tc>
         <w:tc>
           <w:tcPr>
-            <w:tcW w:w="687" w:type="dxa"/>
+            <w:tcW w:w="766" w:type="dxa"/>
             <w:tcMar>
               <w:top w:w="40" w:type="dxa"/>
               <w:left w:w="80" w:type="dxa"/>
@@ -5522,7 +5632,7 @@
         </w:tc>
         <w:tc>
           <w:tcPr>
-            <w:tcW w:w="945" w:type="dxa"/>
+            <w:tcW w:w="936" w:type="dxa"/>
             <w:tcMar>
               <w:top w:w="40" w:type="dxa"/>
               <w:left w:w="80" w:type="dxa"/>
@@ -5547,7 +5657,7 @@
         </w:tc>
         <w:tc>
           <w:tcPr>
-            <w:tcW w:w="859" w:type="dxa"/>
+            <w:tcW w:w="851" w:type="dxa"/>
             <w:tcMar>
               <w:top w:w="40" w:type="dxa"/>
               <w:left w:w="80" w:type="dxa"/>
@@ -5572,7 +5682,7 @@
         </w:tc>
         <w:tc>
           <w:tcPr>
-            <w:tcW w:w="773" w:type="dxa"/>
+            <w:tcW w:w="766" w:type="dxa"/>
             <w:tcMar>
               <w:top w:w="40" w:type="dxa"/>
               <w:left w:w="80" w:type="dxa"/>
@@ -5597,7 +5707,7 @@
         </w:tc>
         <w:tc>
           <w:tcPr>
-            <w:tcW w:w="1208" w:type="dxa"/>
+            <w:tcW w:w="1195" w:type="dxa"/>
             <w:tcMar>
               <w:top w:w="40" w:type="dxa"/>
               <w:left w:w="80" w:type="dxa"/>
@@ -5627,7 +5737,7 @@
         </w:trPr>
         <w:tc>
           <w:tcPr>
-            <w:tcW w:w="2578" w:type="dxa"/>
+            <w:tcW w:w="2554" w:type="dxa"/>
             <w:tcMar>
               <w:top w:w="40" w:type="dxa"/>
               <w:left w:w="80" w:type="dxa"/>
@@ -5652,7 +5762,7 @@
         </w:tc>
         <w:tc>
           <w:tcPr>
-            <w:tcW w:w="601" w:type="dxa"/>
+            <w:tcW w:w="596" w:type="dxa"/>
             <w:tcMar>
               <w:top w:w="40" w:type="dxa"/>
               <w:left w:w="80" w:type="dxa"/>
@@ -5677,7 +5787,7 @@
         </w:tc>
         <w:tc>
           <w:tcPr>
-            <w:tcW w:w="1375" w:type="dxa"/>
+            <w:tcW w:w="1362" w:type="dxa"/>
             <w:tcMar>
               <w:top w:w="40" w:type="dxa"/>
               <w:left w:w="80" w:type="dxa"/>
@@ -5716,7 +5826,7 @@
         </w:tc>
         <w:tc>
           <w:tcPr>
-            <w:tcW w:w="687" w:type="dxa"/>
+            <w:tcW w:w="766" w:type="dxa"/>
             <w:tcMar>
               <w:top w:w="40" w:type="dxa"/>
               <w:left w:w="80" w:type="dxa"/>
@@ -5741,7 +5851,7 @@
         </w:tc>
         <w:tc>
           <w:tcPr>
-            <w:tcW w:w="945" w:type="dxa"/>
+            <w:tcW w:w="936" w:type="dxa"/>
             <w:tcMar>
               <w:top w:w="40" w:type="dxa"/>
               <w:left w:w="80" w:type="dxa"/>
@@ -5766,7 +5876,7 @@
         </w:tc>
         <w:tc>
           <w:tcPr>
-            <w:tcW w:w="859" w:type="dxa"/>
+            <w:tcW w:w="851" w:type="dxa"/>
             <w:tcMar>
               <w:top w:w="40" w:type="dxa"/>
               <w:left w:w="80" w:type="dxa"/>
@@ -5791,7 +5901,7 @@
         </w:tc>
         <w:tc>
           <w:tcPr>
-            <w:tcW w:w="773" w:type="dxa"/>
+            <w:tcW w:w="766" w:type="dxa"/>
             <w:tcMar>
               <w:top w:w="40" w:type="dxa"/>
               <w:left w:w="80" w:type="dxa"/>
@@ -5816,7 +5926,7 @@
         </w:tc>
         <w:tc>
           <w:tcPr>
-            <w:tcW w:w="1208" w:type="dxa"/>
+            <w:tcW w:w="1195" w:type="dxa"/>
             <w:tcMar>
               <w:top w:w="40" w:type="dxa"/>
               <w:left w:w="80" w:type="dxa"/>
@@ -5846,7 +5956,7 @@
         </w:trPr>
         <w:tc>
           <w:tcPr>
-            <w:tcW w:w="2578" w:type="dxa"/>
+            <w:tcW w:w="2554" w:type="dxa"/>
             <w:tcMar>
               <w:top w:w="40" w:type="dxa"/>
               <w:left w:w="80" w:type="dxa"/>
@@ -5871,7 +5981,7 @@
         </w:tc>
         <w:tc>
           <w:tcPr>
-            <w:tcW w:w="601" w:type="dxa"/>
+            <w:tcW w:w="596" w:type="dxa"/>
             <w:tcMar>
               <w:top w:w="40" w:type="dxa"/>
               <w:left w:w="80" w:type="dxa"/>
@@ -5896,7 +6006,7 @@
         </w:tc>
         <w:tc>
           <w:tcPr>
-            <w:tcW w:w="1375" w:type="dxa"/>
+            <w:tcW w:w="1362" w:type="dxa"/>
             <w:tcMar>
               <w:top w:w="40" w:type="dxa"/>
               <w:left w:w="80" w:type="dxa"/>
@@ -5935,7 +6045,7 @@
         </w:tc>
         <w:tc>
           <w:tcPr>
-            <w:tcW w:w="687" w:type="dxa"/>
+            <w:tcW w:w="766" w:type="dxa"/>
             <w:tcMar>
               <w:top w:w="40" w:type="dxa"/>
               <w:left w:w="80" w:type="dxa"/>
@@ -5960,7 +6070,7 @@
         </w:tc>
         <w:tc>
           <w:tcPr>
-            <w:tcW w:w="945" w:type="dxa"/>
+            <w:tcW w:w="936" w:type="dxa"/>
             <w:tcMar>
               <w:top w:w="40" w:type="dxa"/>
               <w:left w:w="80" w:type="dxa"/>
@@ -5985,7 +6095,7 @@
         </w:tc>
         <w:tc>
           <w:tcPr>
-            <w:tcW w:w="859" w:type="dxa"/>
+            <w:tcW w:w="851" w:type="dxa"/>
             <w:tcMar>
               <w:top w:w="40" w:type="dxa"/>
               <w:left w:w="80" w:type="dxa"/>
@@ -6010,7 +6120,7 @@
         </w:tc>
         <w:tc>
           <w:tcPr>
-            <w:tcW w:w="773" w:type="dxa"/>
+            <w:tcW w:w="766" w:type="dxa"/>
             <w:tcMar>
               <w:top w:w="40" w:type="dxa"/>
               <w:left w:w="80" w:type="dxa"/>
@@ -6035,7 +6145,7 @@
         </w:tc>
         <w:tc>
           <w:tcPr>
-            <w:tcW w:w="1208" w:type="dxa"/>
+            <w:tcW w:w="1195" w:type="dxa"/>
             <w:tcMar>
               <w:top w:w="40" w:type="dxa"/>
               <w:left w:w="80" w:type="dxa"/>
@@ -6065,7 +6175,7 @@
         </w:trPr>
         <w:tc>
           <w:tcPr>
-            <w:tcW w:w="2578" w:type="dxa"/>
+            <w:tcW w:w="2554" w:type="dxa"/>
             <w:tcMar>
               <w:top w:w="40" w:type="dxa"/>
               <w:left w:w="80" w:type="dxa"/>
@@ -6090,7 +6200,7 @@
         </w:tc>
         <w:tc>
           <w:tcPr>
-            <w:tcW w:w="601" w:type="dxa"/>
+            <w:tcW w:w="596" w:type="dxa"/>
             <w:tcMar>
               <w:top w:w="40" w:type="dxa"/>
               <w:left w:w="80" w:type="dxa"/>
@@ -6115,7 +6225,7 @@
         </w:tc>
         <w:tc>
           <w:tcPr>
-            <w:tcW w:w="1375" w:type="dxa"/>
+            <w:tcW w:w="1362" w:type="dxa"/>
             <w:tcMar>
               <w:top w:w="40" w:type="dxa"/>
               <w:left w:w="80" w:type="dxa"/>
@@ -6154,7 +6264,7 @@
         </w:tc>
         <w:tc>
           <w:tcPr>
-            <w:tcW w:w="687" w:type="dxa"/>
+            <w:tcW w:w="766" w:type="dxa"/>
             <w:tcMar>
               <w:top w:w="40" w:type="dxa"/>
               <w:left w:w="80" w:type="dxa"/>
@@ -6179,7 +6289,7 @@
         </w:tc>
         <w:tc>
           <w:tcPr>
-            <w:tcW w:w="945" w:type="dxa"/>
+            <w:tcW w:w="936" w:type="dxa"/>
             <w:tcMar>
               <w:top w:w="40" w:type="dxa"/>
               <w:left w:w="80" w:type="dxa"/>
@@ -6204,7 +6314,7 @@
         </w:tc>
         <w:tc>
           <w:tcPr>
-            <w:tcW w:w="859" w:type="dxa"/>
+            <w:tcW w:w="851" w:type="dxa"/>
             <w:tcMar>
               <w:top w:w="40" w:type="dxa"/>
               <w:left w:w="80" w:type="dxa"/>
@@ -6229,7 +6339,7 @@
         </w:tc>
         <w:tc>
           <w:tcPr>
-            <w:tcW w:w="773" w:type="dxa"/>
+            <w:tcW w:w="766" w:type="dxa"/>
             <w:tcMar>
               <w:top w:w="40" w:type="dxa"/>
               <w:left w:w="80" w:type="dxa"/>
@@ -6254,7 +6364,7 @@
         </w:tc>
         <w:tc>
           <w:tcPr>
-            <w:tcW w:w="1208" w:type="dxa"/>
+            <w:tcW w:w="1195" w:type="dxa"/>
             <w:tcMar>
               <w:top w:w="40" w:type="dxa"/>
               <w:left w:w="80" w:type="dxa"/>
@@ -6284,7 +6394,7 @@
         </w:trPr>
         <w:tc>
           <w:tcPr>
-            <w:tcW w:w="2578" w:type="dxa"/>
+            <w:tcW w:w="2554" w:type="dxa"/>
             <w:tcMar>
               <w:top w:w="40" w:type="dxa"/>
               <w:left w:w="80" w:type="dxa"/>
@@ -6309,7 +6419,7 @@
         </w:tc>
         <w:tc>
           <w:tcPr>
-            <w:tcW w:w="601" w:type="dxa"/>
+            <w:tcW w:w="596" w:type="dxa"/>
             <w:tcMar>
               <w:top w:w="40" w:type="dxa"/>
               <w:left w:w="80" w:type="dxa"/>
@@ -6334,7 +6444,7 @@
         </w:tc>
         <w:tc>
           <w:tcPr>
-            <w:tcW w:w="1375" w:type="dxa"/>
+            <w:tcW w:w="1362" w:type="dxa"/>
             <w:tcMar>
               <w:top w:w="40" w:type="dxa"/>
               <w:left w:w="80" w:type="dxa"/>
@@ -6373,7 +6483,7 @@
         </w:tc>
         <w:tc>
           <w:tcPr>
-            <w:tcW w:w="687" w:type="dxa"/>
+            <w:tcW w:w="766" w:type="dxa"/>
             <w:tcMar>
               <w:top w:w="40" w:type="dxa"/>
               <w:left w:w="80" w:type="dxa"/>
@@ -6398,7 +6508,7 @@
         </w:tc>
         <w:tc>
           <w:tcPr>
-            <w:tcW w:w="945" w:type="dxa"/>
+            <w:tcW w:w="936" w:type="dxa"/>
             <w:tcMar>
               <w:top w:w="40" w:type="dxa"/>
               <w:left w:w="80" w:type="dxa"/>
@@ -6423,7 +6533,7 @@
         </w:tc>
         <w:tc>
           <w:tcPr>
-            <w:tcW w:w="859" w:type="dxa"/>
+            <w:tcW w:w="851" w:type="dxa"/>
             <w:tcMar>
               <w:top w:w="40" w:type="dxa"/>
               <w:left w:w="80" w:type="dxa"/>
@@ -6448,7 +6558,7 @@
         </w:tc>
         <w:tc>
           <w:tcPr>
-            <w:tcW w:w="773" w:type="dxa"/>
+            <w:tcW w:w="766" w:type="dxa"/>
             <w:tcMar>
               <w:top w:w="40" w:type="dxa"/>
               <w:left w:w="80" w:type="dxa"/>
@@ -6473,7 +6583,7 @@
         </w:tc>
         <w:tc>
           <w:tcPr>
-            <w:tcW w:w="1208" w:type="dxa"/>
+            <w:tcW w:w="1195" w:type="dxa"/>
             <w:tcMar>
               <w:top w:w="40" w:type="dxa"/>
               <w:left w:w="80" w:type="dxa"/>
@@ -6503,7 +6613,7 @@
         </w:trPr>
         <w:tc>
           <w:tcPr>
-            <w:tcW w:w="2578" w:type="dxa"/>
+            <w:tcW w:w="2554" w:type="dxa"/>
             <w:tcMar>
               <w:top w:w="40" w:type="dxa"/>
               <w:left w:w="80" w:type="dxa"/>
@@ -6565,7 +6675,7 @@
         </w:tc>
         <w:tc>
           <w:tcPr>
-            <w:tcW w:w="601" w:type="dxa"/>
+            <w:tcW w:w="596" w:type="dxa"/>
             <w:tcMar>
               <w:top w:w="40" w:type="dxa"/>
               <w:left w:w="80" w:type="dxa"/>
@@ -6590,7 +6700,7 @@
         </w:tc>
         <w:tc>
           <w:tcPr>
-            <w:tcW w:w="1375" w:type="dxa"/>
+            <w:tcW w:w="1362" w:type="dxa"/>
             <w:tcMar>
               <w:top w:w="40" w:type="dxa"/>
               <w:left w:w="80" w:type="dxa"/>
@@ -6629,7 +6739,7 @@
         </w:tc>
         <w:tc>
           <w:tcPr>
-            <w:tcW w:w="687" w:type="dxa"/>
+            <w:tcW w:w="766" w:type="dxa"/>
             <w:tcMar>
               <w:top w:w="40" w:type="dxa"/>
               <w:left w:w="80" w:type="dxa"/>
@@ -6654,7 +6764,7 @@
         </w:tc>
         <w:tc>
           <w:tcPr>
-            <w:tcW w:w="945" w:type="dxa"/>
+            <w:tcW w:w="936" w:type="dxa"/>
             <w:tcMar>
               <w:top w:w="40" w:type="dxa"/>
               <w:left w:w="80" w:type="dxa"/>
@@ -6679,7 +6789,7 @@
         </w:tc>
         <w:tc>
           <w:tcPr>
-            <w:tcW w:w="859" w:type="dxa"/>
+            <w:tcW w:w="851" w:type="dxa"/>
             <w:tcMar>
               <w:top w:w="40" w:type="dxa"/>
               <w:left w:w="80" w:type="dxa"/>
@@ -6704,7 +6814,7 @@
         </w:tc>
         <w:tc>
           <w:tcPr>
-            <w:tcW w:w="773" w:type="dxa"/>
+            <w:tcW w:w="766" w:type="dxa"/>
             <w:tcMar>
               <w:top w:w="40" w:type="dxa"/>
               <w:left w:w="80" w:type="dxa"/>
@@ -6729,7 +6839,7 @@
         </w:tc>
         <w:tc>
           <w:tcPr>
-            <w:tcW w:w="1208" w:type="dxa"/>
+            <w:tcW w:w="1195" w:type="dxa"/>
             <w:tcMar>
               <w:top w:w="40" w:type="dxa"/>
               <w:left w:w="80" w:type="dxa"/>
@@ -6759,7 +6869,7 @@
         </w:trPr>
         <w:tc>
           <w:tcPr>
-            <w:tcW w:w="2578" w:type="dxa"/>
+            <w:tcW w:w="2554" w:type="dxa"/>
             <w:tcMar>
               <w:top w:w="40" w:type="dxa"/>
               <w:left w:w="80" w:type="dxa"/>
@@ -6784,7 +6894,7 @@
         </w:tc>
         <w:tc>
           <w:tcPr>
-            <w:tcW w:w="601" w:type="dxa"/>
+            <w:tcW w:w="596" w:type="dxa"/>
             <w:tcMar>
               <w:top w:w="40" w:type="dxa"/>
               <w:left w:w="80" w:type="dxa"/>
@@ -6809,7 +6919,7 @@
         </w:tc>
         <w:tc>
           <w:tcPr>
-            <w:tcW w:w="1375" w:type="dxa"/>
+            <w:tcW w:w="1362" w:type="dxa"/>
             <w:tcMar>
               <w:top w:w="40" w:type="dxa"/>
               <w:left w:w="80" w:type="dxa"/>
@@ -6848,7 +6958,7 @@
         </w:tc>
         <w:tc>
           <w:tcPr>
-            <w:tcW w:w="687" w:type="dxa"/>
+            <w:tcW w:w="766" w:type="dxa"/>
             <w:tcMar>
               <w:top w:w="40" w:type="dxa"/>
               <w:left w:w="80" w:type="dxa"/>
@@ -6873,7 +6983,7 @@
         </w:tc>
         <w:tc>
           <w:tcPr>
-            <w:tcW w:w="945" w:type="dxa"/>
+            <w:tcW w:w="936" w:type="dxa"/>
             <w:tcMar>
               <w:top w:w="40" w:type="dxa"/>
               <w:left w:w="80" w:type="dxa"/>
@@ -6898,7 +7008,7 @@
         </w:tc>
         <w:tc>
           <w:tcPr>
-            <w:tcW w:w="859" w:type="dxa"/>
+            <w:tcW w:w="851" w:type="dxa"/>
             <w:tcMar>
               <w:top w:w="40" w:type="dxa"/>
               <w:left w:w="80" w:type="dxa"/>
@@ -6923,7 +7033,7 @@
         </w:tc>
         <w:tc>
           <w:tcPr>
-            <w:tcW w:w="773" w:type="dxa"/>
+            <w:tcW w:w="766" w:type="dxa"/>
             <w:tcMar>
               <w:top w:w="40" w:type="dxa"/>
               <w:left w:w="80" w:type="dxa"/>
@@ -6948,7 +7058,7 @@
         </w:tc>
         <w:tc>
           <w:tcPr>
-            <w:tcW w:w="1208" w:type="dxa"/>
+            <w:tcW w:w="1195" w:type="dxa"/>
             <w:tcMar>
               <w:top w:w="40" w:type="dxa"/>
               <w:left w:w="80" w:type="dxa"/>
@@ -6978,7 +7088,7 @@
         </w:trPr>
         <w:tc>
           <w:tcPr>
-            <w:tcW w:w="2578" w:type="dxa"/>
+            <w:tcW w:w="2554" w:type="dxa"/>
             <w:tcMar>
               <w:top w:w="40" w:type="dxa"/>
               <w:left w:w="80" w:type="dxa"/>
@@ -7091,7 +7201,7 @@
         </w:tc>
         <w:tc>
           <w:tcPr>
-            <w:tcW w:w="601" w:type="dxa"/>
+            <w:tcW w:w="596" w:type="dxa"/>
             <w:tcMar>
               <w:top w:w="40" w:type="dxa"/>
               <w:left w:w="80" w:type="dxa"/>
@@ -7116,7 +7226,7 @@
         </w:tc>
         <w:tc>
           <w:tcPr>
-            <w:tcW w:w="1375" w:type="dxa"/>
+            <w:tcW w:w="1362" w:type="dxa"/>
             <w:tcMar>
               <w:top w:w="40" w:type="dxa"/>
               <w:left w:w="80" w:type="dxa"/>
@@ -7155,7 +7265,7 @@
         </w:tc>
         <w:tc>
           <w:tcPr>
-            <w:tcW w:w="687" w:type="dxa"/>
+            <w:tcW w:w="766" w:type="dxa"/>
             <w:tcMar>
               <w:top w:w="40" w:type="dxa"/>
               <w:left w:w="80" w:type="dxa"/>
@@ -7180,7 +7290,7 @@
         </w:tc>
         <w:tc>
           <w:tcPr>
-            <w:tcW w:w="945" w:type="dxa"/>
+            <w:tcW w:w="936" w:type="dxa"/>
             <w:tcMar>
               <w:top w:w="40" w:type="dxa"/>
               <w:left w:w="80" w:type="dxa"/>
@@ -7205,7 +7315,7 @@
         </w:tc>
         <w:tc>
           <w:tcPr>
-            <w:tcW w:w="859" w:type="dxa"/>
+            <w:tcW w:w="851" w:type="dxa"/>
             <w:tcMar>
               <w:top w:w="40" w:type="dxa"/>
               <w:left w:w="80" w:type="dxa"/>
@@ -7230,7 +7340,7 @@
         </w:tc>
         <w:tc>
           <w:tcPr>
-            <w:tcW w:w="773" w:type="dxa"/>
+            <w:tcW w:w="766" w:type="dxa"/>
             <w:tcMar>
               <w:top w:w="40" w:type="dxa"/>
               <w:left w:w="80" w:type="dxa"/>
@@ -7255,7 +7365,7 @@
         </w:tc>
         <w:tc>
           <w:tcPr>
-            <w:tcW w:w="1208" w:type="dxa"/>
+            <w:tcW w:w="1195" w:type="dxa"/>
             <w:tcMar>
               <w:top w:w="40" w:type="dxa"/>
               <w:left w:w="80" w:type="dxa"/>
@@ -7285,7 +7395,7 @@
         </w:trPr>
         <w:tc>
           <w:tcPr>
-            <w:tcW w:w="2578" w:type="dxa"/>
+            <w:tcW w:w="2554" w:type="dxa"/>
             <w:tcMar>
               <w:top w:w="40" w:type="dxa"/>
               <w:left w:w="80" w:type="dxa"/>
@@ -7353,7 +7463,7 @@
         </w:tc>
         <w:tc>
           <w:tcPr>
-            <w:tcW w:w="601" w:type="dxa"/>
+            <w:tcW w:w="596" w:type="dxa"/>
             <w:tcMar>
               <w:top w:w="40" w:type="dxa"/>
               <w:left w:w="80" w:type="dxa"/>
@@ -7377,7 +7487,7 @@
         </w:tc>
         <w:tc>
           <w:tcPr>
-            <w:tcW w:w="1375" w:type="dxa"/>
+            <w:tcW w:w="1362" w:type="dxa"/>
             <w:tcMar>
               <w:top w:w="40" w:type="dxa"/>
               <w:left w:w="80" w:type="dxa"/>
@@ -7415,7 +7525,7 @@
         </w:tc>
         <w:tc>
           <w:tcPr>
-            <w:tcW w:w="687" w:type="dxa"/>
+            <w:tcW w:w="766" w:type="dxa"/>
             <w:tcMar>
               <w:top w:w="40" w:type="dxa"/>
               <w:left w:w="80" w:type="dxa"/>
@@ -7439,7 +7549,7 @@
         </w:tc>
         <w:tc>
           <w:tcPr>
-            <w:tcW w:w="945" w:type="dxa"/>
+            <w:tcW w:w="936" w:type="dxa"/>
             <w:tcMar>
               <w:top w:w="40" w:type="dxa"/>
               <w:left w:w="80" w:type="dxa"/>
@@ -7463,7 +7573,7 @@
         </w:tc>
         <w:tc>
           <w:tcPr>
-            <w:tcW w:w="859" w:type="dxa"/>
+            <w:tcW w:w="851" w:type="dxa"/>
             <w:tcMar>
               <w:top w:w="40" w:type="dxa"/>
               <w:left w:w="80" w:type="dxa"/>
@@ -7487,7 +7597,7 @@
         </w:tc>
         <w:tc>
           <w:tcPr>
-            <w:tcW w:w="773" w:type="dxa"/>
+            <w:tcW w:w="766" w:type="dxa"/>
             <w:tcMar>
               <w:top w:w="40" w:type="dxa"/>
               <w:left w:w="80" w:type="dxa"/>
@@ -7511,7 +7621,7 @@
         </w:tc>
         <w:tc>
           <w:tcPr>
-            <w:tcW w:w="1208" w:type="dxa"/>
+            <w:tcW w:w="1195" w:type="dxa"/>
             <w:tcMar>
               <w:top w:w="40" w:type="dxa"/>
               <w:left w:w="80" w:type="dxa"/>
@@ -8043,7 +8153,7 @@
           <w:sz w:val="22"/>
           <w:szCs w:val="22"/>
         </w:rPr>
-        <w:t xml:space="preserve"> and </w:t>
+        <w:t xml:space="preserve"> at </w:t>
       </w:r>
       <m:oMath>
         <m:r>
@@ -8052,7 +8162,75 @@
             <w:sz w:val="22"/>
             <w:szCs w:val="22"/>
           </w:rPr>
+          <m:t>K=20</m:t>
+        </m:r>
+      </m:oMath>
+      <w:r>
+        <w:rPr>
+          <w:sz w:val="22"/>
+          <w:szCs w:val="22"/>
+        </w:rPr>
+        <w:t xml:space="preserve"> and </w:t>
+      </w:r>
+      <m:oMath>
+        <m:sSub>
+          <m:e>
+            <m:r>
+              <w:rPr>
+                <w:rFonts w:ascii="Cambria Math" w:hAnsi="Cambria Math"/>
+                <w:sz w:val="22"/>
+                <w:szCs w:val="22"/>
+              </w:rPr>
+              <m:t>p</m:t>
+            </m:r>
+          </m:e>
+          <m:sub>
+            <m:r>
+              <m:rPr>
+                <m:sty m:val="p"/>
+              </m:rPr>
+              <w:rPr>
+                <w:rFonts w:ascii="Cambria Math" w:hAnsi="Cambria Math"/>
+                <w:sz w:val="22"/>
+                <w:szCs w:val="22"/>
+              </w:rPr>
+              <m:t>Holm</m:t>
+            </m:r>
+          </m:sub>
+        </m:sSub>
+      </m:oMath>
+      <w:r>
+        <w:rPr>
+          <w:sz w:val="22"/>
+          <w:szCs w:val="22"/>
+        </w:rPr>
+        <w:t xml:space="preserve"> </w:t>
+      </w:r>
+      <m:oMath>
+        <m:r>
+          <w:rPr>
+            <w:rFonts w:ascii="Cambria Math" w:hAnsi="Cambria Math"/>
+            <w:sz w:val="22"/>
+            <w:szCs w:val="22"/>
+          </w:rPr>
           <m:t>=0.598</m:t>
+        </m:r>
+      </m:oMath>
+      <w:r>
+        <w:rPr>
+          <w:sz w:val="22"/>
+          <w:szCs w:val="22"/>
+        </w:rPr>
+        <w:t xml:space="preserve"> at </w:t>
+      </w:r>
+      <m:oMath>
+        <m:r>
+          <w:rPr>
+            <w:rFonts w:ascii="Cambria Math" w:hAnsi="Cambria Math"/>
+            <w:sz w:val="22"/>
+            <w:szCs w:val="22"/>
+          </w:rPr>
+          <m:t>K=100</m:t>
         </m:r>
       </m:oMath>
       <w:r>
@@ -10338,7 +10516,7 @@
           <w:sz w:val="22"/>
           <w:szCs w:val="22"/>
         </w:rPr>
-        <w:t xml:space="preserve"> run moved 4,146 MB up to its best round and 4,711 MB in all, against 413.2 MB for 30 rounds; the 100-round runs of the first revision moved 275, 521 and 1,377 MB at </w:t>
+        <w:t xml:space="preserve"> run moved 4,146 MB up to its best round and 4,711 MB in all, against 413.2 MB for 30 rounds; the runs of up to 100 rounds in Supplementary Table S2 moved 275, 521 and 1,377 MB at </w:t>
       </w:r>
       <m:oMath>
         <m:r>
@@ -11670,15 +11848,15 @@
         </w:tblCellMar>
       </w:tblPr>
       <w:tblGrid>
-        <w:gridCol w:w="1757"/>
-        <w:gridCol w:w="559"/>
-        <w:gridCol w:w="639"/>
-        <w:gridCol w:w="559"/>
-        <w:gridCol w:w="1597"/>
-        <w:gridCol w:w="958"/>
-        <w:gridCol w:w="958"/>
-        <w:gridCol w:w="958"/>
-        <w:gridCol w:w="1041"/>
+        <w:gridCol w:w="1699"/>
+        <w:gridCol w:w="640"/>
+        <w:gridCol w:w="728"/>
+        <w:gridCol w:w="640"/>
+        <w:gridCol w:w="1533"/>
+        <w:gridCol w:w="925"/>
+        <w:gridCol w:w="928"/>
+        <w:gridCol w:w="928"/>
+        <w:gridCol w:w="1005"/>
       </w:tblGrid>
       <w:tr>
         <w:trPr>
@@ -11687,7 +11865,7 @@
         </w:trPr>
         <w:tc>
           <w:tcPr>
-            <w:tcW w:w="1757" w:type="dxa"/>
+            <w:tcW w:w="1699" w:type="dxa"/>
             <w:shd w:val="clear" w:color="auto" w:fill="1F3864"/>
             <w:tcMar>
               <w:top w:w="40" w:type="dxa"/>
@@ -11716,7 +11894,7 @@
         </w:tc>
         <w:tc>
           <w:tcPr>
-            <w:tcW w:w="559" w:type="dxa"/>
+            <w:tcW w:w="640" w:type="dxa"/>
             <w:shd w:val="clear" w:color="auto" w:fill="1F3864"/>
             <w:tcMar>
               <w:top w:w="40" w:type="dxa"/>
@@ -11745,7 +11923,7 @@
         </w:tc>
         <w:tc>
           <w:tcPr>
-            <w:tcW w:w="639" w:type="dxa"/>
+            <w:tcW w:w="728" w:type="dxa"/>
             <w:shd w:val="clear" w:color="auto" w:fill="1F3864"/>
             <w:tcMar>
               <w:top w:w="40" w:type="dxa"/>
@@ -11787,7 +11965,7 @@
         </w:tc>
         <w:tc>
           <w:tcPr>
-            <w:tcW w:w="559" w:type="dxa"/>
+            <w:tcW w:w="640" w:type="dxa"/>
             <w:shd w:val="clear" w:color="auto" w:fill="1F3864"/>
             <w:tcMar>
               <w:top w:w="40" w:type="dxa"/>
@@ -11829,7 +12007,7 @@
         </w:tc>
         <w:tc>
           <w:tcPr>
-            <w:tcW w:w="1597" w:type="dxa"/>
+            <w:tcW w:w="1533" w:type="dxa"/>
             <w:shd w:val="clear" w:color="auto" w:fill="1F3864"/>
             <w:tcMar>
               <w:top w:w="40" w:type="dxa"/>
@@ -11878,7 +12056,7 @@
         </w:tc>
         <w:tc>
           <w:tcPr>
-            <w:tcW w:w="958" w:type="dxa"/>
+            <w:tcW w:w="925" w:type="dxa"/>
             <w:shd w:val="clear" w:color="auto" w:fill="1F3864"/>
             <w:tcMar>
               <w:top w:w="40" w:type="dxa"/>
@@ -11907,7 +12085,7 @@
         </w:tc>
         <w:tc>
           <w:tcPr>
-            <w:tcW w:w="958" w:type="dxa"/>
+            <w:tcW w:w="928" w:type="dxa"/>
             <w:shd w:val="clear" w:color="auto" w:fill="1F3864"/>
             <w:tcMar>
               <w:top w:w="40" w:type="dxa"/>
@@ -11936,7 +12114,7 @@
         </w:tc>
         <w:tc>
           <w:tcPr>
-            <w:tcW w:w="958" w:type="dxa"/>
+            <w:tcW w:w="928" w:type="dxa"/>
             <w:shd w:val="clear" w:color="auto" w:fill="1F3864"/>
             <w:tcMar>
               <w:top w:w="40" w:type="dxa"/>
@@ -11965,7 +12143,7 @@
         </w:tc>
         <w:tc>
           <w:tcPr>
-            <w:tcW w:w="1041" w:type="dxa"/>
+            <w:tcW w:w="1005" w:type="dxa"/>
             <w:shd w:val="clear" w:color="auto" w:fill="1F3864"/>
             <w:tcMar>
               <w:top w:w="40" w:type="dxa"/>
@@ -11999,7 +12177,7 @@
         </w:trPr>
         <w:tc>
           <w:tcPr>
-            <w:tcW w:w="1757" w:type="dxa"/>
+            <w:tcW w:w="1699" w:type="dxa"/>
             <w:tcMar>
               <w:top w:w="40" w:type="dxa"/>
               <w:left w:w="80" w:type="dxa"/>
@@ -12024,7 +12202,7 @@
         </w:tc>
         <w:tc>
           <w:tcPr>
-            <w:tcW w:w="559" w:type="dxa"/>
+            <w:tcW w:w="640" w:type="dxa"/>
             <w:tcMar>
               <w:top w:w="40" w:type="dxa"/>
               <w:left w:w="80" w:type="dxa"/>
@@ -12049,7 +12227,7 @@
         </w:tc>
         <w:tc>
           <w:tcPr>
-            <w:tcW w:w="639" w:type="dxa"/>
+            <w:tcW w:w="728" w:type="dxa"/>
             <w:tcMar>
               <w:top w:w="40" w:type="dxa"/>
               <w:left w:w="80" w:type="dxa"/>
@@ -12074,7 +12252,7 @@
         </w:tc>
         <w:tc>
           <w:tcPr>
-            <w:tcW w:w="559" w:type="dxa"/>
+            <w:tcW w:w="640" w:type="dxa"/>
             <w:tcMar>
               <w:top w:w="40" w:type="dxa"/>
               <w:left w:w="80" w:type="dxa"/>
@@ -12099,7 +12277,7 @@
         </w:tc>
         <w:tc>
           <w:tcPr>
-            <w:tcW w:w="1597" w:type="dxa"/>
+            <w:tcW w:w="1533" w:type="dxa"/>
             <w:tcMar>
               <w:top w:w="40" w:type="dxa"/>
               <w:left w:w="80" w:type="dxa"/>
@@ -12138,7 +12316,7 @@
         </w:tc>
         <w:tc>
           <w:tcPr>
-            <w:tcW w:w="958" w:type="dxa"/>
+            <w:tcW w:w="925" w:type="dxa"/>
             <w:tcMar>
               <w:top w:w="40" w:type="dxa"/>
               <w:left w:w="80" w:type="dxa"/>
@@ -12163,7 +12341,7 @@
         </w:tc>
         <w:tc>
           <w:tcPr>
-            <w:tcW w:w="958" w:type="dxa"/>
+            <w:tcW w:w="928" w:type="dxa"/>
             <w:tcMar>
               <w:top w:w="40" w:type="dxa"/>
               <w:left w:w="80" w:type="dxa"/>
@@ -12188,7 +12366,7 @@
         </w:tc>
         <w:tc>
           <w:tcPr>
-            <w:tcW w:w="958" w:type="dxa"/>
+            <w:tcW w:w="928" w:type="dxa"/>
             <w:tcMar>
               <w:top w:w="40" w:type="dxa"/>
               <w:left w:w="80" w:type="dxa"/>
@@ -12213,7 +12391,7 @@
         </w:tc>
         <w:tc>
           <w:tcPr>
-            <w:tcW w:w="1041" w:type="dxa"/>
+            <w:tcW w:w="1005" w:type="dxa"/>
             <w:tcMar>
               <w:top w:w="40" w:type="dxa"/>
               <w:left w:w="80" w:type="dxa"/>
@@ -12243,7 +12421,7 @@
         </w:trPr>
         <w:tc>
           <w:tcPr>
-            <w:tcW w:w="1757" w:type="dxa"/>
+            <w:tcW w:w="1699" w:type="dxa"/>
             <w:tcMar>
               <w:top w:w="40" w:type="dxa"/>
               <w:left w:w="80" w:type="dxa"/>
@@ -12268,7 +12446,7 @@
         </w:tc>
         <w:tc>
           <w:tcPr>
-            <w:tcW w:w="559" w:type="dxa"/>
+            <w:tcW w:w="640" w:type="dxa"/>
             <w:tcMar>
               <w:top w:w="40" w:type="dxa"/>
               <w:left w:w="80" w:type="dxa"/>
@@ -12293,7 +12471,7 @@
         </w:tc>
         <w:tc>
           <w:tcPr>
-            <w:tcW w:w="639" w:type="dxa"/>
+            <w:tcW w:w="728" w:type="dxa"/>
             <w:tcMar>
               <w:top w:w="40" w:type="dxa"/>
               <w:left w:w="80" w:type="dxa"/>
@@ -12318,7 +12496,7 @@
         </w:tc>
         <w:tc>
           <w:tcPr>
-            <w:tcW w:w="559" w:type="dxa"/>
+            <w:tcW w:w="640" w:type="dxa"/>
             <w:tcMar>
               <w:top w:w="40" w:type="dxa"/>
               <w:left w:w="80" w:type="dxa"/>
@@ -12343,7 +12521,7 @@
         </w:tc>
         <w:tc>
           <w:tcPr>
-            <w:tcW w:w="1597" w:type="dxa"/>
+            <w:tcW w:w="1533" w:type="dxa"/>
             <w:tcMar>
               <w:top w:w="40" w:type="dxa"/>
               <w:left w:w="80" w:type="dxa"/>
@@ -12382,7 +12560,7 @@
         </w:tc>
         <w:tc>
           <w:tcPr>
-            <w:tcW w:w="958" w:type="dxa"/>
+            <w:tcW w:w="925" w:type="dxa"/>
             <w:tcMar>
               <w:top w:w="40" w:type="dxa"/>
               <w:left w:w="80" w:type="dxa"/>
@@ -12407,7 +12585,7 @@
         </w:tc>
         <w:tc>
           <w:tcPr>
-            <w:tcW w:w="958" w:type="dxa"/>
+            <w:tcW w:w="928" w:type="dxa"/>
             <w:tcMar>
               <w:top w:w="40" w:type="dxa"/>
               <w:left w:w="80" w:type="dxa"/>
@@ -12432,7 +12610,7 @@
         </w:tc>
         <w:tc>
           <w:tcPr>
-            <w:tcW w:w="958" w:type="dxa"/>
+            <w:tcW w:w="928" w:type="dxa"/>
             <w:tcMar>
               <w:top w:w="40" w:type="dxa"/>
               <w:left w:w="80" w:type="dxa"/>
@@ -12457,7 +12635,7 @@
         </w:tc>
         <w:tc>
           <w:tcPr>
-            <w:tcW w:w="1041" w:type="dxa"/>
+            <w:tcW w:w="1005" w:type="dxa"/>
             <w:tcMar>
               <w:top w:w="40" w:type="dxa"/>
               <w:left w:w="80" w:type="dxa"/>
@@ -12487,7 +12665,7 @@
         </w:trPr>
         <w:tc>
           <w:tcPr>
-            <w:tcW w:w="1757" w:type="dxa"/>
+            <w:tcW w:w="1699" w:type="dxa"/>
             <w:tcMar>
               <w:top w:w="40" w:type="dxa"/>
               <w:left w:w="80" w:type="dxa"/>
@@ -12512,7 +12690,7 @@
         </w:tc>
         <w:tc>
           <w:tcPr>
-            <w:tcW w:w="559" w:type="dxa"/>
+            <w:tcW w:w="640" w:type="dxa"/>
             <w:tcMar>
               <w:top w:w="40" w:type="dxa"/>
               <w:left w:w="80" w:type="dxa"/>
@@ -12537,7 +12715,7 @@
         </w:tc>
         <w:tc>
           <w:tcPr>
-            <w:tcW w:w="639" w:type="dxa"/>
+            <w:tcW w:w="728" w:type="dxa"/>
             <w:tcMar>
               <w:top w:w="40" w:type="dxa"/>
               <w:left w:w="80" w:type="dxa"/>
@@ -12562,7 +12740,7 @@
         </w:tc>
         <w:tc>
           <w:tcPr>
-            <w:tcW w:w="559" w:type="dxa"/>
+            <w:tcW w:w="640" w:type="dxa"/>
             <w:tcMar>
               <w:top w:w="40" w:type="dxa"/>
               <w:left w:w="80" w:type="dxa"/>
@@ -12587,7 +12765,7 @@
         </w:tc>
         <w:tc>
           <w:tcPr>
-            <w:tcW w:w="1597" w:type="dxa"/>
+            <w:tcW w:w="1533" w:type="dxa"/>
             <w:tcMar>
               <w:top w:w="40" w:type="dxa"/>
               <w:left w:w="80" w:type="dxa"/>
@@ -12626,7 +12804,7 @@
         </w:tc>
         <w:tc>
           <w:tcPr>
-            <w:tcW w:w="958" w:type="dxa"/>
+            <w:tcW w:w="925" w:type="dxa"/>
             <w:tcMar>
               <w:top w:w="40" w:type="dxa"/>
               <w:left w:w="80" w:type="dxa"/>
@@ -12651,7 +12829,7 @@
         </w:tc>
         <w:tc>
           <w:tcPr>
-            <w:tcW w:w="958" w:type="dxa"/>
+            <w:tcW w:w="928" w:type="dxa"/>
             <w:tcMar>
               <w:top w:w="40" w:type="dxa"/>
               <w:left w:w="80" w:type="dxa"/>
@@ -12676,7 +12854,7 @@
         </w:tc>
         <w:tc>
           <w:tcPr>
-            <w:tcW w:w="958" w:type="dxa"/>
+            <w:tcW w:w="928" w:type="dxa"/>
             <w:tcMar>
               <w:top w:w="40" w:type="dxa"/>
               <w:left w:w="80" w:type="dxa"/>
@@ -12701,7 +12879,7 @@
         </w:tc>
         <w:tc>
           <w:tcPr>
-            <w:tcW w:w="1041" w:type="dxa"/>
+            <w:tcW w:w="1005" w:type="dxa"/>
             <w:tcMar>
               <w:top w:w="40" w:type="dxa"/>
               <w:left w:w="80" w:type="dxa"/>
@@ -12731,7 +12909,7 @@
         </w:trPr>
         <w:tc>
           <w:tcPr>
-            <w:tcW w:w="1757" w:type="dxa"/>
+            <w:tcW w:w="1699" w:type="dxa"/>
             <w:tcMar>
               <w:top w:w="40" w:type="dxa"/>
               <w:left w:w="80" w:type="dxa"/>
@@ -12756,7 +12934,7 @@
         </w:tc>
         <w:tc>
           <w:tcPr>
-            <w:tcW w:w="559" w:type="dxa"/>
+            <w:tcW w:w="640" w:type="dxa"/>
             <w:tcMar>
               <w:top w:w="40" w:type="dxa"/>
               <w:left w:w="80" w:type="dxa"/>
@@ -12781,7 +12959,7 @@
         </w:tc>
         <w:tc>
           <w:tcPr>
-            <w:tcW w:w="639" w:type="dxa"/>
+            <w:tcW w:w="728" w:type="dxa"/>
             <w:tcMar>
               <w:top w:w="40" w:type="dxa"/>
               <w:left w:w="80" w:type="dxa"/>
@@ -12806,7 +12984,7 @@
         </w:tc>
         <w:tc>
           <w:tcPr>
-            <w:tcW w:w="559" w:type="dxa"/>
+            <w:tcW w:w="640" w:type="dxa"/>
             <w:tcMar>
               <w:top w:w="40" w:type="dxa"/>
               <w:left w:w="80" w:type="dxa"/>
@@ -12831,7 +13009,7 @@
         </w:tc>
         <w:tc>
           <w:tcPr>
-            <w:tcW w:w="1597" w:type="dxa"/>
+            <w:tcW w:w="1533" w:type="dxa"/>
             <w:tcMar>
               <w:top w:w="40" w:type="dxa"/>
               <w:left w:w="80" w:type="dxa"/>
@@ -12870,7 +13048,7 @@
         </w:tc>
         <w:tc>
           <w:tcPr>
-            <w:tcW w:w="958" w:type="dxa"/>
+            <w:tcW w:w="925" w:type="dxa"/>
             <w:tcMar>
               <w:top w:w="40" w:type="dxa"/>
               <w:left w:w="80" w:type="dxa"/>
@@ -12895,7 +13073,7 @@
         </w:tc>
         <w:tc>
           <w:tcPr>
-            <w:tcW w:w="958" w:type="dxa"/>
+            <w:tcW w:w="928" w:type="dxa"/>
             <w:tcMar>
               <w:top w:w="40" w:type="dxa"/>
               <w:left w:w="80" w:type="dxa"/>
@@ -12920,7 +13098,7 @@
         </w:tc>
         <w:tc>
           <w:tcPr>
-            <w:tcW w:w="958" w:type="dxa"/>
+            <w:tcW w:w="928" w:type="dxa"/>
             <w:tcMar>
               <w:top w:w="40" w:type="dxa"/>
               <w:left w:w="80" w:type="dxa"/>
@@ -12945,7 +13123,7 @@
         </w:tc>
         <w:tc>
           <w:tcPr>
-            <w:tcW w:w="1041" w:type="dxa"/>
+            <w:tcW w:w="1005" w:type="dxa"/>
             <w:tcMar>
               <w:top w:w="40" w:type="dxa"/>
               <w:left w:w="80" w:type="dxa"/>
@@ -12975,7 +13153,7 @@
         </w:trPr>
         <w:tc>
           <w:tcPr>
-            <w:tcW w:w="1757" w:type="dxa"/>
+            <w:tcW w:w="1699" w:type="dxa"/>
             <w:tcMar>
               <w:top w:w="40" w:type="dxa"/>
               <w:left w:w="80" w:type="dxa"/>
@@ -13000,7 +13178,7 @@
         </w:tc>
         <w:tc>
           <w:tcPr>
-            <w:tcW w:w="559" w:type="dxa"/>
+            <w:tcW w:w="640" w:type="dxa"/>
             <w:tcMar>
               <w:top w:w="40" w:type="dxa"/>
               <w:left w:w="80" w:type="dxa"/>
@@ -13025,7 +13203,7 @@
         </w:tc>
         <w:tc>
           <w:tcPr>
-            <w:tcW w:w="639" w:type="dxa"/>
+            <w:tcW w:w="728" w:type="dxa"/>
             <w:tcMar>
               <w:top w:w="40" w:type="dxa"/>
               <w:left w:w="80" w:type="dxa"/>
@@ -13050,7 +13228,7 @@
         </w:tc>
         <w:tc>
           <w:tcPr>
-            <w:tcW w:w="559" w:type="dxa"/>
+            <w:tcW w:w="640" w:type="dxa"/>
             <w:tcMar>
               <w:top w:w="40" w:type="dxa"/>
               <w:left w:w="80" w:type="dxa"/>
@@ -13075,7 +13253,7 @@
         </w:tc>
         <w:tc>
           <w:tcPr>
-            <w:tcW w:w="1597" w:type="dxa"/>
+            <w:tcW w:w="1533" w:type="dxa"/>
             <w:tcMar>
               <w:top w:w="40" w:type="dxa"/>
               <w:left w:w="80" w:type="dxa"/>
@@ -13114,7 +13292,7 @@
         </w:tc>
         <w:tc>
           <w:tcPr>
-            <w:tcW w:w="958" w:type="dxa"/>
+            <w:tcW w:w="925" w:type="dxa"/>
             <w:tcMar>
               <w:top w:w="40" w:type="dxa"/>
               <w:left w:w="80" w:type="dxa"/>
@@ -13139,7 +13317,7 @@
         </w:tc>
         <w:tc>
           <w:tcPr>
-            <w:tcW w:w="958" w:type="dxa"/>
+            <w:tcW w:w="928" w:type="dxa"/>
             <w:tcMar>
               <w:top w:w="40" w:type="dxa"/>
               <w:left w:w="80" w:type="dxa"/>
@@ -13164,7 +13342,7 @@
         </w:tc>
         <w:tc>
           <w:tcPr>
-            <w:tcW w:w="958" w:type="dxa"/>
+            <w:tcW w:w="928" w:type="dxa"/>
             <w:tcMar>
               <w:top w:w="40" w:type="dxa"/>
               <w:left w:w="80" w:type="dxa"/>
@@ -13189,7 +13367,7 @@
         </w:tc>
         <w:tc>
           <w:tcPr>
-            <w:tcW w:w="1041" w:type="dxa"/>
+            <w:tcW w:w="1005" w:type="dxa"/>
             <w:tcMar>
               <w:top w:w="40" w:type="dxa"/>
               <w:left w:w="80" w:type="dxa"/>
@@ -13219,7 +13397,7 @@
         </w:trPr>
         <w:tc>
           <w:tcPr>
-            <w:tcW w:w="1757" w:type="dxa"/>
+            <w:tcW w:w="1699" w:type="dxa"/>
             <w:tcMar>
               <w:top w:w="40" w:type="dxa"/>
               <w:left w:w="80" w:type="dxa"/>
@@ -13244,7 +13422,7 @@
         </w:tc>
         <w:tc>
           <w:tcPr>
-            <w:tcW w:w="559" w:type="dxa"/>
+            <w:tcW w:w="640" w:type="dxa"/>
             <w:tcMar>
               <w:top w:w="40" w:type="dxa"/>
               <w:left w:w="80" w:type="dxa"/>
@@ -13269,7 +13447,7 @@
         </w:tc>
         <w:tc>
           <w:tcPr>
-            <w:tcW w:w="639" w:type="dxa"/>
+            <w:tcW w:w="728" w:type="dxa"/>
             <w:tcMar>
               <w:top w:w="40" w:type="dxa"/>
               <w:left w:w="80" w:type="dxa"/>
@@ -13294,7 +13472,7 @@
         </w:tc>
         <w:tc>
           <w:tcPr>
-            <w:tcW w:w="559" w:type="dxa"/>
+            <w:tcW w:w="640" w:type="dxa"/>
             <w:tcMar>
               <w:top w:w="40" w:type="dxa"/>
               <w:left w:w="80" w:type="dxa"/>
@@ -13319,7 +13497,7 @@
         </w:tc>
         <w:tc>
           <w:tcPr>
-            <w:tcW w:w="1597" w:type="dxa"/>
+            <w:tcW w:w="1533" w:type="dxa"/>
             <w:tcMar>
               <w:top w:w="40" w:type="dxa"/>
               <w:left w:w="80" w:type="dxa"/>
@@ -13358,7 +13536,7 @@
         </w:tc>
         <w:tc>
           <w:tcPr>
-            <w:tcW w:w="958" w:type="dxa"/>
+            <w:tcW w:w="925" w:type="dxa"/>
             <w:tcMar>
               <w:top w:w="40" w:type="dxa"/>
               <w:left w:w="80" w:type="dxa"/>
@@ -13383,7 +13561,7 @@
         </w:tc>
         <w:tc>
           <w:tcPr>
-            <w:tcW w:w="958" w:type="dxa"/>
+            <w:tcW w:w="928" w:type="dxa"/>
             <w:tcMar>
               <w:top w:w="40" w:type="dxa"/>
               <w:left w:w="80" w:type="dxa"/>
@@ -13408,7 +13586,7 @@
         </w:tc>
         <w:tc>
           <w:tcPr>
-            <w:tcW w:w="958" w:type="dxa"/>
+            <w:tcW w:w="928" w:type="dxa"/>
             <w:tcMar>
               <w:top w:w="40" w:type="dxa"/>
               <w:left w:w="80" w:type="dxa"/>
@@ -13433,7 +13611,7 @@
         </w:tc>
         <w:tc>
           <w:tcPr>
-            <w:tcW w:w="1041" w:type="dxa"/>
+            <w:tcW w:w="1005" w:type="dxa"/>
             <w:tcMar>
               <w:top w:w="40" w:type="dxa"/>
               <w:left w:w="80" w:type="dxa"/>
@@ -13463,7 +13641,7 @@
         </w:trPr>
         <w:tc>
           <w:tcPr>
-            <w:tcW w:w="1757" w:type="dxa"/>
+            <w:tcW w:w="1699" w:type="dxa"/>
             <w:tcMar>
               <w:top w:w="40" w:type="dxa"/>
               <w:left w:w="80" w:type="dxa"/>
@@ -13487,7 +13665,7 @@
         </w:tc>
         <w:tc>
           <w:tcPr>
-            <w:tcW w:w="559" w:type="dxa"/>
+            <w:tcW w:w="640" w:type="dxa"/>
             <w:tcMar>
               <w:top w:w="40" w:type="dxa"/>
               <w:left w:w="80" w:type="dxa"/>
@@ -13511,7 +13689,7 @@
         </w:tc>
         <w:tc>
           <w:tcPr>
-            <w:tcW w:w="639" w:type="dxa"/>
+            <w:tcW w:w="728" w:type="dxa"/>
             <w:tcMar>
               <w:top w:w="40" w:type="dxa"/>
               <w:left w:w="80" w:type="dxa"/>
@@ -13535,7 +13713,7 @@
         </w:tc>
         <w:tc>
           <w:tcPr>
-            <w:tcW w:w="559" w:type="dxa"/>
+            <w:tcW w:w="640" w:type="dxa"/>
             <w:tcMar>
               <w:top w:w="40" w:type="dxa"/>
               <w:left w:w="80" w:type="dxa"/>
@@ -13559,7 +13737,7 @@
         </w:tc>
         <w:tc>
           <w:tcPr>
-            <w:tcW w:w="1597" w:type="dxa"/>
+            <w:tcW w:w="1533" w:type="dxa"/>
             <w:tcMar>
               <w:top w:w="40" w:type="dxa"/>
               <w:left w:w="80" w:type="dxa"/>
@@ -13597,7 +13775,7 @@
         </w:tc>
         <w:tc>
           <w:tcPr>
-            <w:tcW w:w="958" w:type="dxa"/>
+            <w:tcW w:w="925" w:type="dxa"/>
             <w:tcMar>
               <w:top w:w="40" w:type="dxa"/>
               <w:left w:w="80" w:type="dxa"/>
@@ -13621,7 +13799,7 @@
         </w:tc>
         <w:tc>
           <w:tcPr>
-            <w:tcW w:w="958" w:type="dxa"/>
+            <w:tcW w:w="928" w:type="dxa"/>
             <w:tcMar>
               <w:top w:w="40" w:type="dxa"/>
               <w:left w:w="80" w:type="dxa"/>
@@ -13645,7 +13823,7 @@
         </w:tc>
         <w:tc>
           <w:tcPr>
-            <w:tcW w:w="958" w:type="dxa"/>
+            <w:tcW w:w="928" w:type="dxa"/>
             <w:tcMar>
               <w:top w:w="40" w:type="dxa"/>
               <w:left w:w="80" w:type="dxa"/>
@@ -13669,7 +13847,7 @@
         </w:tc>
         <w:tc>
           <w:tcPr>
-            <w:tcW w:w="1041" w:type="dxa"/>
+            <w:tcW w:w="1005" w:type="dxa"/>
             <w:tcMar>
               <w:top w:w="40" w:type="dxa"/>
               <w:left w:w="80" w:type="dxa"/>
@@ -14100,12 +14278,12 @@
         </w:tblCellMar>
       </w:tblPr>
       <w:tblGrid>
-        <w:gridCol w:w="530"/>
-        <w:gridCol w:w="1526"/>
-        <w:gridCol w:w="1393"/>
-        <w:gridCol w:w="1791"/>
-        <w:gridCol w:w="1858"/>
-        <w:gridCol w:w="1928"/>
+        <w:gridCol w:w="761"/>
+        <w:gridCol w:w="1502"/>
+        <w:gridCol w:w="1372"/>
+        <w:gridCol w:w="1734"/>
+        <w:gridCol w:w="1797"/>
+        <w:gridCol w:w="1860"/>
       </w:tblGrid>
       <w:tr>
         <w:trPr>
@@ -14114,7 +14292,7 @@
         </w:trPr>
         <w:tc>
           <w:tcPr>
-            <w:tcW w:w="530" w:type="dxa"/>
+            <w:tcW w:w="761" w:type="dxa"/>
             <w:shd w:val="clear" w:color="auto" w:fill="1F3864"/>
             <w:tcMar>
               <w:top w:w="40" w:type="dxa"/>
@@ -14143,7 +14321,7 @@
         </w:tc>
         <w:tc>
           <w:tcPr>
-            <w:tcW w:w="1526" w:type="dxa"/>
+            <w:tcW w:w="1502" w:type="dxa"/>
             <w:shd w:val="clear" w:color="auto" w:fill="1F3864"/>
             <w:tcMar>
               <w:top w:w="40" w:type="dxa"/>
@@ -14172,7 +14350,7 @@
         </w:tc>
         <w:tc>
           <w:tcPr>
-            <w:tcW w:w="1393" w:type="dxa"/>
+            <w:tcW w:w="1372" w:type="dxa"/>
             <w:shd w:val="clear" w:color="auto" w:fill="1F3864"/>
             <w:tcMar>
               <w:top w:w="40" w:type="dxa"/>
@@ -14201,7 +14379,7 @@
         </w:tc>
         <w:tc>
           <w:tcPr>
-            <w:tcW w:w="1791" w:type="dxa"/>
+            <w:tcW w:w="1734" w:type="dxa"/>
             <w:shd w:val="clear" w:color="auto" w:fill="1F3864"/>
             <w:tcMar>
               <w:top w:w="40" w:type="dxa"/>
@@ -14262,7 +14440,7 @@
         </w:tc>
         <w:tc>
           <w:tcPr>
-            <w:tcW w:w="1858" w:type="dxa"/>
+            <w:tcW w:w="1797" w:type="dxa"/>
             <w:shd w:val="clear" w:color="auto" w:fill="1F3864"/>
             <w:tcMar>
               <w:top w:w="40" w:type="dxa"/>
@@ -14333,7 +14511,7 @@
         </w:tc>
         <w:tc>
           <w:tcPr>
-            <w:tcW w:w="1928" w:type="dxa"/>
+            <w:tcW w:w="1860" w:type="dxa"/>
             <w:shd w:val="clear" w:color="auto" w:fill="1F3864"/>
             <w:tcMar>
               <w:top w:w="40" w:type="dxa"/>
@@ -14419,7 +14597,7 @@
         </w:trPr>
         <w:tc>
           <w:tcPr>
-            <w:tcW w:w="530" w:type="dxa"/>
+            <w:tcW w:w="761" w:type="dxa"/>
             <w:tcMar>
               <w:top w:w="40" w:type="dxa"/>
               <w:left w:w="80" w:type="dxa"/>
@@ -14444,7 +14622,7 @@
         </w:tc>
         <w:tc>
           <w:tcPr>
-            <w:tcW w:w="1526" w:type="dxa"/>
+            <w:tcW w:w="1502" w:type="dxa"/>
             <w:tcMar>
               <w:top w:w="40" w:type="dxa"/>
               <w:left w:w="80" w:type="dxa"/>
@@ -14469,7 +14647,7 @@
         </w:tc>
         <w:tc>
           <w:tcPr>
-            <w:tcW w:w="1393" w:type="dxa"/>
+            <w:tcW w:w="1372" w:type="dxa"/>
             <w:tcMar>
               <w:top w:w="40" w:type="dxa"/>
               <w:left w:w="80" w:type="dxa"/>
@@ -14494,7 +14672,7 @@
         </w:tc>
         <w:tc>
           <w:tcPr>
-            <w:tcW w:w="1791" w:type="dxa"/>
+            <w:tcW w:w="1734" w:type="dxa"/>
             <w:tcMar>
               <w:top w:w="40" w:type="dxa"/>
               <w:left w:w="80" w:type="dxa"/>
@@ -14519,7 +14697,7 @@
         </w:tc>
         <w:tc>
           <w:tcPr>
-            <w:tcW w:w="1858" w:type="dxa"/>
+            <w:tcW w:w="1797" w:type="dxa"/>
             <w:tcMar>
               <w:top w:w="40" w:type="dxa"/>
               <w:left w:w="80" w:type="dxa"/>
@@ -14544,7 +14722,7 @@
         </w:tc>
         <w:tc>
           <w:tcPr>
-            <w:tcW w:w="1928" w:type="dxa"/>
+            <w:tcW w:w="1860" w:type="dxa"/>
             <w:tcMar>
               <w:top w:w="40" w:type="dxa"/>
               <w:left w:w="80" w:type="dxa"/>
@@ -14574,7 +14752,7 @@
         </w:trPr>
         <w:tc>
           <w:tcPr>
-            <w:tcW w:w="530" w:type="dxa"/>
+            <w:tcW w:w="761" w:type="dxa"/>
             <w:tcMar>
               <w:top w:w="40" w:type="dxa"/>
               <w:left w:w="80" w:type="dxa"/>
@@ -14599,7 +14777,7 @@
         </w:tc>
         <w:tc>
           <w:tcPr>
-            <w:tcW w:w="1526" w:type="dxa"/>
+            <w:tcW w:w="1502" w:type="dxa"/>
             <w:tcMar>
               <w:top w:w="40" w:type="dxa"/>
               <w:left w:w="80" w:type="dxa"/>
@@ -14624,7 +14802,7 @@
         </w:tc>
         <w:tc>
           <w:tcPr>
-            <w:tcW w:w="1393" w:type="dxa"/>
+            <w:tcW w:w="1372" w:type="dxa"/>
             <w:tcMar>
               <w:top w:w="40" w:type="dxa"/>
               <w:left w:w="80" w:type="dxa"/>
@@ -14649,7 +14827,7 @@
         </w:tc>
         <w:tc>
           <w:tcPr>
-            <w:tcW w:w="1791" w:type="dxa"/>
+            <w:tcW w:w="1734" w:type="dxa"/>
             <w:tcMar>
               <w:top w:w="40" w:type="dxa"/>
               <w:left w:w="80" w:type="dxa"/>
@@ -14674,7 +14852,7 @@
         </w:tc>
         <w:tc>
           <w:tcPr>
-            <w:tcW w:w="1858" w:type="dxa"/>
+            <w:tcW w:w="1797" w:type="dxa"/>
             <w:tcMar>
               <w:top w:w="40" w:type="dxa"/>
               <w:left w:w="80" w:type="dxa"/>
@@ -14699,7 +14877,7 @@
         </w:tc>
         <w:tc>
           <w:tcPr>
-            <w:tcW w:w="1928" w:type="dxa"/>
+            <w:tcW w:w="1860" w:type="dxa"/>
             <w:tcMar>
               <w:top w:w="40" w:type="dxa"/>
               <w:left w:w="80" w:type="dxa"/>
@@ -14729,7 +14907,7 @@
         </w:trPr>
         <w:tc>
           <w:tcPr>
-            <w:tcW w:w="530" w:type="dxa"/>
+            <w:tcW w:w="761" w:type="dxa"/>
             <w:tcMar>
               <w:top w:w="40" w:type="dxa"/>
               <w:left w:w="80" w:type="dxa"/>
@@ -14753,7 +14931,7 @@
         </w:tc>
         <w:tc>
           <w:tcPr>
-            <w:tcW w:w="1526" w:type="dxa"/>
+            <w:tcW w:w="1502" w:type="dxa"/>
             <w:tcMar>
               <w:top w:w="40" w:type="dxa"/>
               <w:left w:w="80" w:type="dxa"/>
@@ -14777,7 +14955,7 @@
         </w:tc>
         <w:tc>
           <w:tcPr>
-            <w:tcW w:w="1393" w:type="dxa"/>
+            <w:tcW w:w="1372" w:type="dxa"/>
             <w:tcMar>
               <w:top w:w="40" w:type="dxa"/>
               <w:left w:w="80" w:type="dxa"/>
@@ -14801,7 +14979,7 @@
         </w:tc>
         <w:tc>
           <w:tcPr>
-            <w:tcW w:w="1791" w:type="dxa"/>
+            <w:tcW w:w="1734" w:type="dxa"/>
             <w:tcMar>
               <w:top w:w="40" w:type="dxa"/>
               <w:left w:w="80" w:type="dxa"/>
@@ -14825,7 +15003,7 @@
         </w:tc>
         <w:tc>
           <w:tcPr>
-            <w:tcW w:w="1858" w:type="dxa"/>
+            <w:tcW w:w="1797" w:type="dxa"/>
             <w:tcMar>
               <w:top w:w="40" w:type="dxa"/>
               <w:left w:w="80" w:type="dxa"/>
@@ -14849,7 +15027,7 @@
         </w:tc>
         <w:tc>
           <w:tcPr>
-            <w:tcW w:w="1928" w:type="dxa"/>
+            <w:tcW w:w="1860" w:type="dxa"/>
             <w:tcMar>
               <w:top w:w="40" w:type="dxa"/>
               <w:left w:w="80" w:type="dxa"/>
@@ -14939,7 +15117,7 @@
           <w:sz w:val="22"/>
           <w:szCs w:val="22"/>
         </w:rPr>
-        <w:t xml:space="preserve"> it ranged from 3.8 to 10.7 % across cohorts and at </w:t>
+        <w:t xml:space="preserve"> it ranged from 3.8 to 10.0 % across cohorts and at </w:t>
       </w:r>
       <m:oMath>
         <m:r>
@@ -15271,7 +15449,7 @@
           <w:sz w:val="22"/>
           <w:szCs w:val="22"/>
         </w:rPr>
-        <w:t xml:space="preserve"> (20.7 MB), 16-bit updates (41.3 MB) and half participation with stragglers (37.2 MB), moved more than the binary encodings but less than the comma-separated file: partial participation lowered total traffic to 37.2 MB and 16-bit updates halved it. Neither of the two lost accuracy: the changes in pooled MAE were −0.3 and −1.1 % (</w:t>
+        <w:t xml:space="preserve"> (20.7 MB), 16-bit updates (41.3 MB) and half participation with stragglers (37.2 MB), moved more than the binary encodings but less than the comma-separated file: 16-bit updates halved the traffic and half participation with stragglers lowered it further. Neither lost accuracy: against full participation with 32-bit updates, the pooled MAE changed by −0.3 % with 16-bit updates (</w:t>
       </w:r>
       <m:oMath>
         <m:r>
@@ -15288,7 +15466,7 @@
           <w:sz w:val="22"/>
           <w:szCs w:val="22"/>
         </w:rPr>
-        <w:t xml:space="preserve"> and −9.3, </w:t>
+        <w:t xml:space="preserve">, </w:t>
       </w:r>
       <m:oMath>
         <m:sSub>
@@ -15339,7 +15517,7 @@
           <w:sz w:val="22"/>
           <w:szCs w:val="22"/>
         </w:rPr>
-        <w:t xml:space="preserve"> and </w:t>
+        <w:t xml:space="preserve">; 92 % of households did better) and by −1.1 % with half participation (</w:t>
       </w:r>
       <m:oMath>
         <m:r>
@@ -15348,6 +15526,57 @@
             <w:sz w:val="22"/>
             <w:szCs w:val="22"/>
           </w:rPr>
+          <m:t>Δ=−9.3</m:t>
+        </m:r>
+      </m:oMath>
+      <w:r>
+        <w:rPr>
+          <w:sz w:val="22"/>
+          <w:szCs w:val="22"/>
+        </w:rPr>
+        <w:t xml:space="preserve">, </w:t>
+      </w:r>
+      <m:oMath>
+        <m:sSub>
+          <m:e>
+            <m:r>
+              <w:rPr>
+                <w:rFonts w:ascii="Cambria Math" w:hAnsi="Cambria Math"/>
+                <w:sz w:val="22"/>
+                <w:szCs w:val="22"/>
+              </w:rPr>
+              <m:t>p</m:t>
+            </m:r>
+          </m:e>
+          <m:sub>
+            <m:r>
+              <m:rPr>
+                <m:sty m:val="p"/>
+              </m:rPr>
+              <w:rPr>
+                <w:rFonts w:ascii="Cambria Math" w:hAnsi="Cambria Math"/>
+                <w:sz w:val="22"/>
+                <w:szCs w:val="22"/>
+              </w:rPr>
+              <m:t>Holm</m:t>
+            </m:r>
+          </m:sub>
+        </m:sSub>
+      </m:oMath>
+      <w:r>
+        <w:rPr>
+          <w:sz w:val="22"/>
+          <w:szCs w:val="22"/>
+        </w:rPr>
+        <w:t xml:space="preserve"> </w:t>
+      </w:r>
+      <m:oMath>
+        <m:r>
+          <w:rPr>
+            <w:rFonts w:ascii="Cambria Math" w:hAnsi="Cambria Math"/>
+            <w:sz w:val="22"/>
+            <w:szCs w:val="22"/>
+          </w:rPr>
           <m:t>=0.807</m:t>
         </m:r>
       </m:oMath>
@@ -15356,7 +15585,7 @@
           <w:sz w:val="22"/>
           <w:szCs w:val="22"/>
         </w:rPr>
-        <w:t xml:space="preserve">), and 92 and 94 % of households did better. Both plausibly act as mild regularisers. Training to a plateau multiplies traffic by the number of rounds (see the plateau runs above), so at these settings the bandwidth comparison with the raw readings only becomes less favourable to federation with longer training.</w:t>
+        <w:t xml:space="preserve">; 94 % of households did better). Both plausibly act as mild regularisers. Training to a plateau multiplies traffic by the number of rounds (see the plateau runs above), so at these settings the bandwidth comparison with the raw readings only becomes less favourable to federation with longer training.</w:t>
       </w:r>
     </w:p>
     <w:p>
@@ -16489,7 +16718,7 @@
           <w:sz w:val="22"/>
           <w:szCs w:val="22"/>
         </w:rPr>
-        <w:t xml:space="preserve">After a fixed budget, most of the accuracy cost of federation in this setting came from fragmentation and from the budget itself. Splitting the same data over more clients cost accuracy even when the clients were statistically identical, as described for local stochastic gradient descent: smaller shards give each client fewer steps between averages, and the average of many short local trajectories progresses less per round than one pass over the pooled data [36]–[38]. Training to a plateau recovered a large part of this cost, at a traffic of gigabytes per run, but not all of it, and the part that remained with identical clients was of the same order as the part attributable to heterogeneity. Heterogeneity mainly slowed early convergence, through disagreeing client updates, which is why drift remedies helped little here, whereas a server-side adaptive optimiser, which acts on the budget, narrowed the meter-level gap. The heterogeneity reachable with these homes was limited (</w:t>
+        <w:t xml:space="preserve">After a fixed budget, most of the accuracy cost of federation in this setting came from fragmentation and from the budget itself. Splitting the same data over more clients cost accuracy even when the clients were statistically identical, as described for local stochastic gradient descent: smaller shards give each client fewer steps between averages, and the average of many short local trajectories progresses less per round than one pass over the pooled data [36]–[38]. Training to a plateau recovered a large part of this cost, at a traffic of gigabytes per run, but not all of it, and the part that remained with identical clients was of the same order as the part attributable to heterogeneity. Heterogeneity mainly slowed early convergence, through disagreeing client updates, which may explain why drift remedies helped little here, whereas a server-side adaptive optimiser, which acts on the budget, narrowed the meter-level gap. The heterogeneity reachable with these homes was limited (</w:t>
       </w:r>
       <m:oMath>
         <m:sSub>

</xml_diff>

<commit_message>
Final corrections: regression effect sizes, plateau traffic, Fig. 1, references, README
</commit_message>
<xml_diff>
--- a/paper/docx/manuscript.docx
+++ b/paper/docx/manuscript.docx
@@ -163,7 +163,7 @@
           <w:sz w:val="22"/>
           <w:szCs w:val="22"/>
         </w:rPr>
-        <w:t xml:space="preserve">Federated learning (FL) is proposed for household load forecasting because meter readings stay at home. Its accuracy loss is usually blamed on differences between households, and its bandwidth advantage is assumed. This study separated heterogeneity, data fragmentation and training budget on 100 London households from the Low Carbon London trial with a fixed one-step long short-term memory forecaster. The homes were split over 1 to 100 clients, including a control that dealt training windows, not homes, to clients so that clients did not differ. After 30 rounds, the gap to centralised training grew from 1.8 % at five clients to 10.0 % with one home per client, and with 20 or more clients the control kept 71–96 % of the gap in three cohorts. Training to a plateau, at up to 4,711 MB per run, shrank the gap to 1.8–5.4 % for homes and 1.3–3.5 % for the control: much of the cost was training budget, and part remained without heterogeneity. Over 100 rounds, server-side Adam narrowed the one-home-per-client gap from 7.3 to 5.3 %; kept client optimiser state and client SGD did not help. With 20 or more clients, federated training moved more bytes than the raw readings in every encoding tested. With one home per client, federated averaging with local fine-tuning (0.0849 kWh mean absolute error) still lost to local models (0.0839 kWh). For one-step forecasts, federation here is a governance choice, not a bandwidth saving.</w:t>
+        <w:t xml:space="preserve">Federated learning (FL) is proposed for household load forecasting because meter readings stay at home. Its accuracy loss is usually blamed on differences between households, and its bandwidth advantage is assumed. This study separated heterogeneity, data fragmentation and training budget on 100 London households from the Low Carbon London trial with a fixed one-step long short-term memory forecaster. The homes were split over 1 to 100 clients, including a control that dealt training windows, not homes, to clients so that clients did not differ. After 30 rounds, the gap to centralised training grew from 1.8 % at five clients to 10.0 % with one home per client, and with 20 or more clients the control kept 71–96 % of the gap in three cohorts. Training to a plateau, at about 4,711 MB per run on average (6,887 MB for the run stopped at the round cap), shrank the gap to 1.8–5.4 % for homes and 1.3–3.5 % for the control: much of the cost was training budget, and part remained without heterogeneity. Over 100 rounds, server-side Adam narrowed the one-home-per-client gap from 7.3 to 5.3 %; kept client optimiser state and client SGD did not help. With 20 or more clients, federated training moved more bytes than the raw readings in every encoding tested. With one home per client, federated averaging with local fine-tuning (0.0849 kWh mean absolute error) still lost to local models (0.0839 kWh). For one-step forecasts, federation here is a governance choice, not a bandwidth saving.</w:t>
       </w:r>
     </w:p>
     <w:p>
@@ -8843,7 +8843,73 @@
           <w:sz w:val="22"/>
           <w:szCs w:val="22"/>
         </w:rPr>
-        <w:t xml:space="preserve">). Over the ranges tested, going from five to 100 clients corresponds to 0.0039 kWh, whereas the whole range of </w:t>
+        <w:t xml:space="preserve">). Over the ranges tested, the three-term model gives 0.0043 kWh for going from five to 100 clients (</w:t>
+      </w:r>
+      <m:oMath>
+        <m:r>
+          <w:rPr>
+            <w:rFonts w:ascii="Cambria Math" w:hAnsi="Cambria Math"/>
+            <w:sz w:val="22"/>
+            <w:szCs w:val="22"/>
+          </w:rPr>
+          <m:t>1.43×</m:t>
+        </m:r>
+        <m:sSup>
+          <m:e>
+            <m:r>
+              <w:rPr>
+                <w:rFonts w:ascii="Cambria Math" w:hAnsi="Cambria Math"/>
+                <w:sz w:val="22"/>
+                <w:szCs w:val="22"/>
+              </w:rPr>
+              <m:t>10</m:t>
+            </m:r>
+          </m:e>
+          <m:sup>
+            <m:r>
+              <w:rPr>
+                <w:rFonts w:ascii="Cambria Math" w:hAnsi="Cambria Math"/>
+                <w:sz w:val="22"/>
+                <w:szCs w:val="22"/>
+              </w:rPr>
+              <m:t>−3</m:t>
+            </m:r>
+          </m:sup>
+        </m:sSup>
+        <m:r>
+          <w:rPr>
+            <w:rFonts w:ascii="Cambria Math" w:hAnsi="Cambria Math"/>
+            <w:sz w:val="22"/>
+            <w:szCs w:val="22"/>
+          </w:rPr>
+          <m:t>×</m:t>
+        </m:r>
+        <m:r>
+          <m:rPr>
+            <m:sty m:val="p"/>
+          </m:rPr>
+          <w:rPr>
+            <w:rFonts w:ascii="Cambria Math" w:hAnsi="Cambria Math"/>
+            <w:sz w:val="22"/>
+            <w:szCs w:val="22"/>
+          </w:rPr>
+          <m:t>ln</m:t>
+        </m:r>
+        <m:r>
+          <w:rPr>
+            <w:rFonts w:ascii="Cambria Math" w:hAnsi="Cambria Math"/>
+            <w:sz w:val="22"/>
+            <w:szCs w:val="22"/>
+          </w:rPr>
+          <m:t>20</m:t>
+        </m:r>
+      </m:oMath>
+      <w:r>
+        <w:rPr>
+          <w:sz w:val="22"/>
+          <w:szCs w:val="22"/>
+        </w:rPr>
+        <w:t xml:space="preserve">), whereas the whole range of </w:t>
       </w:r>
       <m:oMath>
         <m:sSub>
@@ -8894,7 +8960,7 @@
           <w:sz w:val="22"/>
           <w:szCs w:val="22"/>
         </w:rPr>
-        <w:t xml:space="preserve"> (0.0019 to 0.0213) corresponds to 0.0011 kWh.</w:t>
+        <w:t xml:space="preserve"> (0.0019 to 0.0213) corresponds to 0.0008 kWh.</w:t>
       </w:r>
     </w:p>
     <w:p>
@@ -10499,7 +10565,7 @@
           <w:sz w:val="22"/>
           <w:szCs w:val="22"/>
         </w:rPr>
-        <w:t xml:space="preserve"> to −15.2) were not significant after correction. Reaching the plateau was expensive: a </w:t>
+        <w:t xml:space="preserve"> to −15.2) were not significant after correction. Reaching the plateau was expensive: on average a </w:t>
       </w:r>
       <m:oMath>
         <m:r>
@@ -10516,7 +10582,7 @@
           <w:sz w:val="22"/>
           <w:szCs w:val="22"/>
         </w:rPr>
-        <w:t xml:space="preserve"> run moved 4,146 MB up to its best round and 4,711 MB in all, against 413.2 MB for 30 rounds; the runs of up to 100 rounds in Supplementary Table S2 moved 275, 521 and 1,377 MB at </w:t>
+        <w:t xml:space="preserve"> run with homes moved 4,146 MB up to its best round and 4,711 MB in all, and the run stopped at the 500-round cap moved 6,887 MB, against 413.2 MB for 30 rounds; the runs of up to 100 rounds in Supplementary Table S2 moved 275, 521 and 1,377 MB at </w:t>
       </w:r>
       <m:oMath>
         <m:r>
@@ -16765,7 +16831,7 @@
           <w:sz w:val="22"/>
           <w:szCs w:val="22"/>
         </w:rPr>
-        <w:t xml:space="preserve">In practice, the number of clients and the budget were the most consequential choices. Federating five aggregated clients cost 1.8 % in MAE after 30 rounds; meter-level federation cost 10.0 % after 30 rounds and 5.4 % at the plateau, after up to 4,711 MB of traffic. Since one household's eight months of training readings occupy about 47 kB even at 4 bytes per value, less than one 68.9 kB message, federation at this scale is a governance choice based on data minimisation and consent, not a bandwidth saving. Operators should federate few, aggregated clients held by a trusted hub such as a building gateway or energy community, budget rounds by local steps rather than epochs, fine-tune locally and check errors per consumption tier; a hub gains little from federating with other hubs unless the shared model is fine-tuned on its homes.</w:t>
+        <w:t xml:space="preserve">In practice, the number of clients and the budget were the most consequential choices. Federating five aggregated clients cost 1.8 % in MAE after 30 rounds; meter-level federation cost 10.0 % after 30 rounds and 5.4 % at the plateau, after about 4,711 MB of traffic per run on average (6,887 MB for the capped run). Since one household's eight months of training readings occupy about 47 kB even at 4 bytes per value, less than one 68.9 kB message, federation at this scale is a governance choice based on data minimisation and consent, not a bandwidth saving. Operators should federate few, aggregated clients held by a trusted hub such as a building gateway or energy community, budget rounds by local steps rather than epochs, fine-tune locally and check errors per consumption tier; a hub gains little from federating with other hubs unless the shared model is fine-tuned on its homes.</w:t>
       </w:r>
     </w:p>
     <w:p>
@@ -18079,7 +18145,7 @@
           <w:sz w:val="20"/>
           <w:szCs w:val="20"/>
         </w:rPr>
-        <w:t xml:space="preserve">Mhou, K., Senekane, M. (2025). HAPI-FedProx: Heterogeneity-aware adaptive proximal optimization for federated learning. In Artificial Intelligence Research (SACAIR), pp. 272-286. https://doi.org/10.1007/978-3-032-11733-5_17</w:t>
+        <w:t xml:space="preserve">Mhou, K., Senekane, M. (2025). HAPI-FedProx: Heterogeneity-aware adaptive proximal optimization for federated learning. In Artificial Intelligence Research (SACAIR 2025), Communications in Computer and Information Science, vol. 2784, pp. 272-286. https://doi.org/10.1007/978-3-032-11733-5_17</w:t>
       </w:r>
     </w:p>
     <w:p>

</xml_diff>